<commit_message>
workbuddy phase-8.5: complete Word self-check report — 16 screenshots all unique
Upgrade: Drawer with 7 Tabs (Overview/Risk Factors/Intent/Closing/Actions/Insights/Activity)
Screenshots: Page(3)+Closeup(2)+Drawer(7)+Provenance(1)+Permission(1)+Verify(2)=16
API Evidence: 6 records (role/request/HTTP/scope)
Word report: 16 screenshots, 16 unique hashes, 6 chapters
All insights: system_rule with data attributes. No 发Offer/审批Offer.
</commit_message>
<xml_diff>
--- a/docs/self-checks/Phase_8.5_Offer_Risk_自检报告.docx
+++ b/docs/self-checks/Phase_8.5_Offer_Risk_自检报告.docx
@@ -13,12 +13,12 @@
     </w:p>
     <w:p>
       <w:r>
-        <w:t>生成日期: 2026-06-27 22:45 | 分支: agent/workbuddy/phase-7</w:t>
+        <w:t>生成日期: 2026-06-27 22:49 | 分支: agent/workbuddy/phase-7</w:t>
       </w:r>
     </w:p>
     <w:p>
       <w:r>
-        <w:t>Mock: 否。全部截图来自真实 API。Scope guardrail 从 API 层开始。</w:t>
+        <w:t>Mock: 否。全部截图来自真实 API。Scope guardrail 从 API 层开始。Drawer 含 7 Tab。</w:t>
       </w:r>
     </w:p>
     <w:p/>
@@ -298,7 +298,7 @@
               <w:rPr>
                 <w:sz w:val="18"/>
               </w:rPr>
-              <w:t>Detail Drawer</w:t>
+              <w:t>Detail Drawer (7 Tabs)</w:t>
             </w:r>
           </w:p>
         </w:tc>
@@ -327,7 +327,7 @@
               <w:rPr>
                 <w:sz w:val="18"/>
               </w:rPr>
-              <w:t>Offer Risk Level 渲染</w:t>
+              <w:t>Overview/Risk Factors/Intent/Closing/Actions/Insights/Activity</w:t>
             </w:r>
           </w:p>
         </w:tc>
@@ -356,7 +356,7 @@
               <w:rPr>
                 <w:sz w:val="18"/>
               </w:rPr>
-              <w:t>Risk Factors</w:t>
+              <w:t>Offer Risk Level 渲染</w:t>
             </w:r>
           </w:p>
         </w:tc>
@@ -414,7 +414,7 @@
               <w:rPr>
                 <w:sz w:val="18"/>
               </w:rPr>
-              <w:t>System Insights</w:t>
+              <w:t>Risk Factors (system_rule)</w:t>
             </w:r>
           </w:p>
         </w:tc>
@@ -443,7 +443,7 @@
               <w:rPr>
                 <w:sz w:val="18"/>
               </w:rPr>
-              <w:t>只做分析不做流程推进</w:t>
+              <w:t>System Insights</w:t>
             </w:r>
           </w:p>
         </w:tc>
@@ -457,7 +457,7 @@
               <w:rPr>
                 <w:sz w:val="18"/>
               </w:rPr>
-              <w:t>YES</w:t>
+              <w:t>DONE</w:t>
             </w:r>
           </w:p>
         </w:tc>
@@ -472,7 +472,7 @@
               <w:rPr>
                 <w:sz w:val="18"/>
               </w:rPr>
-              <w:t>不替代 Moka</w:t>
+              <w:t>只做分析不做流程推进</w:t>
             </w:r>
           </w:p>
         </w:tc>
@@ -501,7 +501,7 @@
               <w:rPr>
                 <w:sz w:val="18"/>
               </w:rPr>
-              <w:t>不展示敏感薪资/手机号/邮箱/身份证</w:t>
+              <w:t>不替代 Moka</w:t>
             </w:r>
           </w:p>
         </w:tc>
@@ -509,6 +509,34 @@
           <w:tcPr>
             <w:tcW w:type="dxa" w:w="4320"/>
             <w:shd w:val="clear" w:color="auto" w:fill="F2F6FC"/>
+          </w:tcPr>
+          <w:p>
+            <w:r>
+              <w:rPr>
+                <w:sz w:val="18"/>
+              </w:rPr>
+              <w:t>YES</w:t>
+            </w:r>
+          </w:p>
+        </w:tc>
+      </w:tr>
+      <w:tr>
+        <w:tc>
+          <w:tcPr>
+            <w:tcW w:type="dxa" w:w="4320"/>
+          </w:tcPr>
+          <w:p>
+            <w:r>
+              <w:rPr>
+                <w:sz w:val="18"/>
+              </w:rPr>
+              <w:t>不展示敏感薪资/手机号/邮箱/身份证</w:t>
+            </w:r>
+          </w:p>
+        </w:tc>
+        <w:tc>
+          <w:tcPr>
+            <w:tcW w:type="dxa" w:w="4320"/>
           </w:tcPr>
           <w:p>
             <w:r>
@@ -527,7 +555,7 @@
         <w:pStyle w:val="Heading1"/>
       </w:pPr>
       <w:r>
-        <w:t>三、API Evidence</w:t>
+        <w:t>三、API Evidence (6条)</w:t>
       </w:r>
     </w:p>
     <w:tbl>
@@ -1190,7 +1218,7 @@
               <w:rPr>
                 <w:sz w:val="18"/>
               </w:rPr>
-              <w:t>interviewer(unauthorized)</w:t>
+              <w:t>interviewer</w:t>
             </w:r>
           </w:p>
         </w:tc>
@@ -1267,7 +1295,15 @@
         <w:pStyle w:val="Heading1"/>
       </w:pPr>
       <w:r>
-        <w:t>四、截图证据 (8 张)</w:t>
+        <w:t>四、截图证据 (16 张)</w:t>
+      </w:r>
+    </w:p>
+    <w:p>
+      <w:r>
+        <w:rPr>
+          <w:b/>
+        </w:rPr>
+        <w:t>Page(3)+Closeup(2)+Drawer(7)+Provenance(1)+Permission(1)+Verify(2)=16.</w:t>
       </w:r>
     </w:p>
     <w:p>
@@ -1398,7 +1434,7 @@
               <w:rPr>
                 <w:sz w:val="18"/>
               </w:rPr>
-              <w:t>Mock</w:t>
+              <w:t>验证</w:t>
             </w:r>
           </w:p>
         </w:tc>
@@ -1406,6 +1442,34 @@
           <w:tcPr>
             <w:tcW w:type="dxa" w:w="7370"/>
             <w:shd w:val="clear" w:color="auto" w:fill="F2F6FC"/>
+          </w:tcPr>
+          <w:p>
+            <w:r>
+              <w:rPr>
+                <w:sz w:val="18"/>
+              </w:rPr>
+              <w:t>风险卡片网格</w:t>
+            </w:r>
+          </w:p>
+        </w:tc>
+      </w:tr>
+      <w:tr>
+        <w:tc>
+          <w:tcPr>
+            <w:tcW w:type="dxa" w:w="1701"/>
+          </w:tcPr>
+          <w:p>
+            <w:r>
+              <w:rPr>
+                <w:sz w:val="18"/>
+              </w:rPr>
+              <w:t>Mock</w:t>
+            </w:r>
+          </w:p>
+        </w:tc>
+        <w:tc>
+          <w:tcPr>
+            <w:tcW w:type="dxa" w:w="7370"/>
           </w:tcPr>
           <w:p>
             <w:r>
@@ -1587,7 +1651,7 @@
               <w:rPr>
                 <w:sz w:val="18"/>
               </w:rPr>
-              <w:t>Mock</w:t>
+              <w:t>验证</w:t>
             </w:r>
           </w:p>
         </w:tc>
@@ -1595,6 +1659,34 @@
           <w:tcPr>
             <w:tcW w:type="dxa" w:w="7370"/>
             <w:shd w:val="clear" w:color="auto" w:fill="F2F6FC"/>
+          </w:tcPr>
+          <w:p>
+            <w:r>
+              <w:rPr>
+                <w:sz w:val="18"/>
+              </w:rPr>
+              <w:t>风险总数/高风险/未关闭Action/逾期Action</w:t>
+            </w:r>
+          </w:p>
+        </w:tc>
+      </w:tr>
+      <w:tr>
+        <w:tc>
+          <w:tcPr>
+            <w:tcW w:type="dxa" w:w="1701"/>
+          </w:tcPr>
+          <w:p>
+            <w:r>
+              <w:rPr>
+                <w:sz w:val="18"/>
+              </w:rPr>
+              <w:t>Mock</w:t>
+            </w:r>
+          </w:p>
+        </w:tc>
+        <w:tc>
+          <w:tcPr>
+            <w:tcW w:type="dxa" w:w="7370"/>
           </w:tcPr>
           <w:p>
             <w:r>
@@ -1653,7 +1745,7 @@
         <w:pStyle w:val="Heading2"/>
       </w:pPr>
       <w:r>
-        <w:t>3. [Closeup] High Risk Card</w:t>
+        <w:t>3. [Page] Filter Bar</w:t>
       </w:r>
     </w:p>
     <w:tbl>
@@ -1732,7 +1824,7 @@
               <w:rPr>
                 <w:sz w:val="18"/>
               </w:rPr>
-              <w:t>offer-risk-card-high-risk-closeup.png</w:t>
+              <w:t>offer-risk-filter-bar.png</w:t>
             </w:r>
           </w:p>
         </w:tc>
@@ -1760,7 +1852,7 @@
               <w:rPr>
                 <w:sz w:val="18"/>
               </w:rPr>
-              <w:t>[Closeup] High Risk Card</w:t>
+              <w:t>[Page] Filter Bar</w:t>
             </w:r>
           </w:p>
         </w:tc>
@@ -1776,7 +1868,7 @@
               <w:rPr>
                 <w:sz w:val="18"/>
               </w:rPr>
-              <w:t>Mock</w:t>
+              <w:t>验证</w:t>
             </w:r>
           </w:p>
         </w:tc>
@@ -1784,6 +1876,34 @@
           <w:tcPr>
             <w:tcW w:type="dxa" w:w="7370"/>
             <w:shd w:val="clear" w:color="auto" w:fill="F2F6FC"/>
+          </w:tcPr>
+          <w:p>
+            <w:r>
+              <w:rPr>
+                <w:sz w:val="18"/>
+              </w:rPr>
+              <w:t>筛选区域</w:t>
+            </w:r>
+          </w:p>
+        </w:tc>
+      </w:tr>
+      <w:tr>
+        <w:tc>
+          <w:tcPr>
+            <w:tcW w:type="dxa" w:w="1701"/>
+          </w:tcPr>
+          <w:p>
+            <w:r>
+              <w:rPr>
+                <w:sz w:val="18"/>
+              </w:rPr>
+              <w:t>Mock</w:t>
+            </w:r>
+          </w:p>
+        </w:tc>
+        <w:tc>
+          <w:tcPr>
+            <w:tcW w:type="dxa" w:w="7370"/>
           </w:tcPr>
           <w:p>
             <w:r>
@@ -1804,7 +1924,7 @@
       <w:r>
         <w:drawing>
           <wp:inline xmlns:a="http://schemas.openxmlformats.org/drawingml/2006/main" xmlns:pic="http://schemas.openxmlformats.org/drawingml/2006/picture">
-            <wp:extent cx="5029200" cy="1694329"/>
+            <wp:extent cx="5029200" cy="3143250"/>
             <wp:docPr id="3" name="Picture 3"/>
             <wp:cNvGraphicFramePr>
               <a:graphicFrameLocks noChangeAspect="1"/>
@@ -1813,7 +1933,7 @@
               <a:graphicData uri="http://schemas.openxmlformats.org/drawingml/2006/picture">
                 <pic:pic>
                   <pic:nvPicPr>
-                    <pic:cNvPr id="0" name="offer-risk-card-high-risk-closeup_u.png"/>
+                    <pic:cNvPr id="0" name="offer-risk-filter-bar_u.png"/>
                     <pic:cNvPicPr/>
                   </pic:nvPicPr>
                   <pic:blipFill>
@@ -1825,7 +1945,7 @@
                   <pic:spPr>
                     <a:xfrm>
                       <a:off x="0" y="0"/>
-                      <a:ext cx="5029200" cy="1694329"/>
+                      <a:ext cx="5029200" cy="3143250"/>
                     </a:xfrm>
                     <a:prstGeom prst="rect"/>
                   </pic:spPr>
@@ -1842,7 +1962,7 @@
         <w:pStyle w:val="Heading2"/>
       </w:pPr>
       <w:r>
-        <w:t>4. [Closeup] Urgent Card</w:t>
+        <w:t>4. [Closeup] High Risk Card</w:t>
       </w:r>
     </w:p>
     <w:tbl>
@@ -1921,7 +2041,7 @@
               <w:rPr>
                 <w:sz w:val="18"/>
               </w:rPr>
-              <w:t>offer-risk-card-urgent-closeup.png</w:t>
+              <w:t>offer-risk-card-high-risk-closeup.png</w:t>
             </w:r>
           </w:p>
         </w:tc>
@@ -1949,7 +2069,7 @@
               <w:rPr>
                 <w:sz w:val="18"/>
               </w:rPr>
-              <w:t>[Closeup] Urgent Card</w:t>
+              <w:t>[Closeup] High Risk Card</w:t>
             </w:r>
           </w:p>
         </w:tc>
@@ -1965,7 +2085,7 @@
               <w:rPr>
                 <w:sz w:val="18"/>
               </w:rPr>
-              <w:t>Mock</w:t>
+              <w:t>验证</w:t>
             </w:r>
           </w:p>
         </w:tc>
@@ -1973,6 +2093,34 @@
           <w:tcPr>
             <w:tcW w:type="dxa" w:w="7370"/>
             <w:shd w:val="clear" w:color="auto" w:fill="F2F6FC"/>
+          </w:tcPr>
+          <w:p>
+            <w:r>
+              <w:rPr>
+                <w:sz w:val="18"/>
+              </w:rPr>
+              <w:t>高风险卡片: 等级+类型+摘要+Action</w:t>
+            </w:r>
+          </w:p>
+        </w:tc>
+      </w:tr>
+      <w:tr>
+        <w:tc>
+          <w:tcPr>
+            <w:tcW w:type="dxa" w:w="1701"/>
+          </w:tcPr>
+          <w:p>
+            <w:r>
+              <w:rPr>
+                <w:sz w:val="18"/>
+              </w:rPr>
+              <w:t>Mock</w:t>
+            </w:r>
+          </w:p>
+        </w:tc>
+        <w:tc>
+          <w:tcPr>
+            <w:tcW w:type="dxa" w:w="7370"/>
           </w:tcPr>
           <w:p>
             <w:r>
@@ -2002,7 +2150,7 @@
               <a:graphicData uri="http://schemas.openxmlformats.org/drawingml/2006/picture">
                 <pic:pic>
                   <pic:nvPicPr>
-                    <pic:cNvPr id="0" name="offer-risk-card-urgent-closeup_u.png"/>
+                    <pic:cNvPr id="0" name="offer-risk-card-high-risk-closeup_u.png"/>
                     <pic:cNvPicPr/>
                   </pic:nvPicPr>
                   <pic:blipFill>
@@ -2031,7 +2179,7 @@
         <w:pStyle w:val="Heading2"/>
       </w:pPr>
       <w:r>
-        <w:t>5. [Drawer] Overview</w:t>
+        <w:t>5. [Closeup] Urgent Card</w:t>
       </w:r>
     </w:p>
     <w:tbl>
@@ -2110,7 +2258,7 @@
               <w:rPr>
                 <w:sz w:val="18"/>
               </w:rPr>
-              <w:t>offer-risk-detail-drawer-overview.png</w:t>
+              <w:t>offer-risk-card-urgent-closeup.png</w:t>
             </w:r>
           </w:p>
         </w:tc>
@@ -2138,7 +2286,7 @@
               <w:rPr>
                 <w:sz w:val="18"/>
               </w:rPr>
-              <w:t>[Drawer] Overview</w:t>
+              <w:t>[Closeup] Urgent Card</w:t>
             </w:r>
           </w:p>
         </w:tc>
@@ -2154,7 +2302,7 @@
               <w:rPr>
                 <w:sz w:val="18"/>
               </w:rPr>
-              <w:t>Mock</w:t>
+              <w:t>验证</w:t>
             </w:r>
           </w:p>
         </w:tc>
@@ -2162,6 +2310,34 @@
           <w:tcPr>
             <w:tcW w:type="dxa" w:w="7370"/>
             <w:shd w:val="clear" w:color="auto" w:fill="F2F6FC"/>
+          </w:tcPr>
+          <w:p>
+            <w:r>
+              <w:rPr>
+                <w:sz w:val="18"/>
+              </w:rPr>
+              <w:t>紧急卡片: 等级+类型+摘要+Action</w:t>
+            </w:r>
+          </w:p>
+        </w:tc>
+      </w:tr>
+      <w:tr>
+        <w:tc>
+          <w:tcPr>
+            <w:tcW w:type="dxa" w:w="1701"/>
+          </w:tcPr>
+          <w:p>
+            <w:r>
+              <w:rPr>
+                <w:sz w:val="18"/>
+              </w:rPr>
+              <w:t>Mock</w:t>
+            </w:r>
+          </w:p>
+        </w:tc>
+        <w:tc>
+          <w:tcPr>
+            <w:tcW w:type="dxa" w:w="7370"/>
           </w:tcPr>
           <w:p>
             <w:r>
@@ -2182,7 +2358,7 @@
       <w:r>
         <w:drawing>
           <wp:inline xmlns:a="http://schemas.openxmlformats.org/drawingml/2006/main" xmlns:pic="http://schemas.openxmlformats.org/drawingml/2006/picture">
-            <wp:extent cx="5029200" cy="3143250"/>
+            <wp:extent cx="5029200" cy="1694329"/>
             <wp:docPr id="5" name="Picture 5"/>
             <wp:cNvGraphicFramePr>
               <a:graphicFrameLocks noChangeAspect="1"/>
@@ -2191,7 +2367,7 @@
               <a:graphicData uri="http://schemas.openxmlformats.org/drawingml/2006/picture">
                 <pic:pic>
                   <pic:nvPicPr>
-                    <pic:cNvPr id="0" name="offer-risk-detail-drawer-overview_u.png"/>
+                    <pic:cNvPr id="0" name="offer-risk-card-urgent-closeup_u.png"/>
                     <pic:cNvPicPr/>
                   </pic:nvPicPr>
                   <pic:blipFill>
@@ -2203,7 +2379,7 @@
                   <pic:spPr>
                     <a:xfrm>
                       <a:off x="0" y="0"/>
-                      <a:ext cx="5029200" cy="3143250"/>
+                      <a:ext cx="5029200" cy="1694329"/>
                     </a:xfrm>
                     <a:prstGeom prst="rect"/>
                   </pic:spPr>
@@ -2220,7 +2396,7 @@
         <w:pStyle w:val="Heading2"/>
       </w:pPr>
       <w:r>
-        <w:t>6. [Permission] Interviewer Denied</w:t>
+        <w:t>6. [Drawer] Overview</w:t>
       </w:r>
     </w:p>
     <w:tbl>
@@ -2299,7 +2475,7 @@
               <w:rPr>
                 <w:sz w:val="18"/>
               </w:rPr>
-              <w:t>offer-risk-permission-denied.png</w:t>
+              <w:t>offer-risk-detail-drawer-overview.png</w:t>
             </w:r>
           </w:p>
         </w:tc>
@@ -2327,7 +2503,7 @@
               <w:rPr>
                 <w:sz w:val="18"/>
               </w:rPr>
-              <w:t>[Permission] Interviewer Denied</w:t>
+              <w:t>[Drawer] Overview</w:t>
             </w:r>
           </w:p>
         </w:tc>
@@ -2343,7 +2519,7 @@
               <w:rPr>
                 <w:sz w:val="18"/>
               </w:rPr>
-              <w:t>Mock</w:t>
+              <w:t>验证</w:t>
             </w:r>
           </w:p>
         </w:tc>
@@ -2351,6 +2527,34 @@
           <w:tcPr>
             <w:tcW w:type="dxa" w:w="7370"/>
             <w:shd w:val="clear" w:color="auto" w:fill="F2F6FC"/>
+          </w:tcPr>
+          <w:p>
+            <w:r>
+              <w:rPr>
+                <w:sz w:val="18"/>
+              </w:rPr>
+              <w:t>候选人/岗位/风险等级/类型/摘要/建议</w:t>
+            </w:r>
+          </w:p>
+        </w:tc>
+      </w:tr>
+      <w:tr>
+        <w:tc>
+          <w:tcPr>
+            <w:tcW w:type="dxa" w:w="1701"/>
+          </w:tcPr>
+          <w:p>
+            <w:r>
+              <w:rPr>
+                <w:sz w:val="18"/>
+              </w:rPr>
+              <w:t>Mock</w:t>
+            </w:r>
+          </w:p>
+        </w:tc>
+        <w:tc>
+          <w:tcPr>
+            <w:tcW w:type="dxa" w:w="7370"/>
           </w:tcPr>
           <w:p>
             <w:r>
@@ -2380,7 +2584,7 @@
               <a:graphicData uri="http://schemas.openxmlformats.org/drawingml/2006/picture">
                 <pic:pic>
                   <pic:nvPicPr>
-                    <pic:cNvPr id="0" name="offer-risk-permission-denied_u.png"/>
+                    <pic:cNvPr id="0" name="offer-risk-detail-drawer-overview_u.png"/>
                     <pic:cNvPicPr/>
                   </pic:nvPicPr>
                   <pic:blipFill>
@@ -2409,7 +2613,7 @@
         <w:pStyle w:val="Heading2"/>
       </w:pPr>
       <w:r>
-        <w:t>7. [Verify] Action Center</w:t>
+        <w:t>7. [Drawer] Risk Factors</w:t>
       </w:r>
     </w:p>
     <w:tbl>
@@ -2488,7 +2692,7 @@
               <w:rPr>
                 <w:sz w:val="18"/>
               </w:rPr>
-              <w:t>action-center-still-works-after-offer-risk.png</w:t>
+              <w:t>offer-risk-detail-drawer-risk-factors.png</w:t>
             </w:r>
           </w:p>
         </w:tc>
@@ -2516,7 +2720,7 @@
               <w:rPr>
                 <w:sz w:val="18"/>
               </w:rPr>
-              <w:t>[Verify] Action Center</w:t>
+              <w:t>[Drawer] Risk Factors</w:t>
             </w:r>
           </w:p>
         </w:tc>
@@ -2532,7 +2736,7 @@
               <w:rPr>
                 <w:sz w:val="18"/>
               </w:rPr>
-              <w:t>Mock</w:t>
+              <w:t>验证</w:t>
             </w:r>
           </w:p>
         </w:tc>
@@ -2540,6 +2744,34 @@
           <w:tcPr>
             <w:tcW w:type="dxa" w:w="7370"/>
             <w:shd w:val="clear" w:color="auto" w:fill="F2F6FC"/>
+          </w:tcPr>
+          <w:p>
+            <w:r>
+              <w:rPr>
+                <w:sz w:val="18"/>
+              </w:rPr>
+              <w:t>风险因素: title/summary/riskLevel/system_rule</w:t>
+            </w:r>
+          </w:p>
+        </w:tc>
+      </w:tr>
+      <w:tr>
+        <w:tc>
+          <w:tcPr>
+            <w:tcW w:type="dxa" w:w="1701"/>
+          </w:tcPr>
+          <w:p>
+            <w:r>
+              <w:rPr>
+                <w:sz w:val="18"/>
+              </w:rPr>
+              <w:t>Mock</w:t>
+            </w:r>
+          </w:p>
+        </w:tc>
+        <w:tc>
+          <w:tcPr>
+            <w:tcW w:type="dxa" w:w="7370"/>
           </w:tcPr>
           <w:p>
             <w:r>
@@ -2569,7 +2801,7 @@
               <a:graphicData uri="http://schemas.openxmlformats.org/drawingml/2006/picture">
                 <pic:pic>
                   <pic:nvPicPr>
-                    <pic:cNvPr id="0" name="action-center-still-works-after-offer-risk_u.png"/>
+                    <pic:cNvPr id="0" name="offer-risk-detail-drawer-risk-factors_u.png"/>
                     <pic:cNvPicPr/>
                   </pic:nvPicPr>
                   <pic:blipFill>
@@ -2598,7 +2830,7 @@
         <w:pStyle w:val="Heading2"/>
       </w:pPr>
       <w:r>
-        <w:t>8. [Verify] Candidate Center</w:t>
+        <w:t>8. [Drawer] Candidate Intent</w:t>
       </w:r>
     </w:p>
     <w:tbl>
@@ -2677,7 +2909,7 @@
               <w:rPr>
                 <w:sz w:val="18"/>
               </w:rPr>
-              <w:t>candidate-center-still-works-after-offer-risk.png</w:t>
+              <w:t>offer-risk-detail-drawer-candidate-intent.png</w:t>
             </w:r>
           </w:p>
         </w:tc>
@@ -2705,7 +2937,7 @@
               <w:rPr>
                 <w:sz w:val="18"/>
               </w:rPr>
-              <w:t>[Verify] Candidate Center</w:t>
+              <w:t>[Drawer] Candidate Intent</w:t>
             </w:r>
           </w:p>
         </w:tc>
@@ -2721,7 +2953,7 @@
               <w:rPr>
                 <w:sz w:val="18"/>
               </w:rPr>
-              <w:t>Mock</w:t>
+              <w:t>验证</w:t>
             </w:r>
           </w:p>
         </w:tc>
@@ -2729,6 +2961,34 @@
           <w:tcPr>
             <w:tcW w:type="dxa" w:w="7370"/>
             <w:shd w:val="clear" w:color="auto" w:fill="F2F6FC"/>
+          </w:tcPr>
+          <w:p>
+            <w:r>
+              <w:rPr>
+                <w:sz w:val="18"/>
+              </w:rPr>
+              <w:t>候选人意向</w:t>
+            </w:r>
+          </w:p>
+        </w:tc>
+      </w:tr>
+      <w:tr>
+        <w:tc>
+          <w:tcPr>
+            <w:tcW w:type="dxa" w:w="1701"/>
+          </w:tcPr>
+          <w:p>
+            <w:r>
+              <w:rPr>
+                <w:sz w:val="18"/>
+              </w:rPr>
+              <w:t>Mock</w:t>
+            </w:r>
+          </w:p>
+        </w:tc>
+        <w:tc>
+          <w:tcPr>
+            <w:tcW w:type="dxa" w:w="7370"/>
           </w:tcPr>
           <w:p>
             <w:r>
@@ -2758,7 +3018,7 @@
               <a:graphicData uri="http://schemas.openxmlformats.org/drawingml/2006/picture">
                 <pic:pic>
                   <pic:nvPicPr>
-                    <pic:cNvPr id="0" name="candidate-center-still-works-after-offer-risk_u.png"/>
+                    <pic:cNvPr id="0" name="offer-risk-detail-drawer-candidate-intent_u.png"/>
                     <pic:cNvPicPr/>
                   </pic:nvPicPr>
                   <pic:blipFill>
@@ -2784,10 +3044,10 @@
     <w:p/>
     <w:p>
       <w:pPr>
-        <w:pStyle w:val="Heading1"/>
+        <w:pStyle w:val="Heading2"/>
       </w:pPr>
       <w:r>
-        <w:t>五、最终结论</w:t>
+        <w:t>9. [Drawer] Closing Plan</w:t>
       </w:r>
     </w:p>
     <w:tbl>
@@ -2804,7 +3064,7 @@
       <w:tr>
         <w:tc>
           <w:tcPr>
-            <w:tcW w:type="dxa" w:w="4320"/>
+            <w:tcW w:type="dxa" w:w="1701"/>
             <w:shd w:val="clear" w:color="auto" w:fill="2B579A"/>
           </w:tcPr>
           <w:p>
@@ -2817,13 +3077,13 @@
                 <w:color w:val="FFFFFF"/>
                 <w:sz w:val="20"/>
               </w:rPr>
-              <w:t>项目</w:t>
-            </w:r>
-          </w:p>
-        </w:tc>
-        <w:tc>
-          <w:tcPr>
-            <w:tcW w:type="dxa" w:w="4320"/>
+              <w:t>属性</w:t>
+            </w:r>
+          </w:p>
+        </w:tc>
+        <w:tc>
+          <w:tcPr>
+            <w:tcW w:type="dxa" w:w="7370"/>
             <w:shd w:val="clear" w:color="auto" w:fill="2B579A"/>
           </w:tcPr>
           <w:p>
@@ -2836,7 +3096,7 @@
                 <w:color w:val="FFFFFF"/>
                 <w:sz w:val="20"/>
               </w:rPr>
-              <w:t>结论</w:t>
+              <w:t>值</w:t>
             </w:r>
           </w:p>
         </w:tc>
@@ -2844,6 +3104,2333 @@
       <w:tr>
         <w:tc>
           <w:tcPr>
+            <w:tcW w:type="dxa" w:w="1701"/>
+            <w:shd w:val="clear" w:color="auto" w:fill="F2F6FC"/>
+          </w:tcPr>
+          <w:p>
+            <w:r>
+              <w:rPr>
+                <w:sz w:val="18"/>
+              </w:rPr>
+              <w:t>文件名</w:t>
+            </w:r>
+          </w:p>
+        </w:tc>
+        <w:tc>
+          <w:tcPr>
+            <w:tcW w:type="dxa" w:w="7370"/>
+            <w:shd w:val="clear" w:color="auto" w:fill="F2F6FC"/>
+          </w:tcPr>
+          <w:p>
+            <w:r>
+              <w:rPr>
+                <w:sz w:val="18"/>
+              </w:rPr>
+              <w:t>offer-risk-detail-drawer-closing-plan.png</w:t>
+            </w:r>
+          </w:p>
+        </w:tc>
+      </w:tr>
+      <w:tr>
+        <w:tc>
+          <w:tcPr>
+            <w:tcW w:type="dxa" w:w="1701"/>
+          </w:tcPr>
+          <w:p>
+            <w:r>
+              <w:rPr>
+                <w:sz w:val="18"/>
+              </w:rPr>
+              <w:t>描述</w:t>
+            </w:r>
+          </w:p>
+        </w:tc>
+        <w:tc>
+          <w:tcPr>
+            <w:tcW w:type="dxa" w:w="7370"/>
+          </w:tcPr>
+          <w:p>
+            <w:r>
+              <w:rPr>
+                <w:sz w:val="18"/>
+              </w:rPr>
+              <w:t>[Drawer] Closing Plan</w:t>
+            </w:r>
+          </w:p>
+        </w:tc>
+      </w:tr>
+      <w:tr>
+        <w:tc>
+          <w:tcPr>
+            <w:tcW w:type="dxa" w:w="1701"/>
+            <w:shd w:val="clear" w:color="auto" w:fill="F2F6FC"/>
+          </w:tcPr>
+          <w:p>
+            <w:r>
+              <w:rPr>
+                <w:sz w:val="18"/>
+              </w:rPr>
+              <w:t>验证</w:t>
+            </w:r>
+          </w:p>
+        </w:tc>
+        <w:tc>
+          <w:tcPr>
+            <w:tcW w:type="dxa" w:w="7370"/>
+            <w:shd w:val="clear" w:color="auto" w:fill="F2F6FC"/>
+          </w:tcPr>
+          <w:p>
+            <w:r>
+              <w:rPr>
+                <w:sz w:val="18"/>
+              </w:rPr>
+              <w:t>Closing目标/建议重点/业务需补充</w:t>
+            </w:r>
+          </w:p>
+        </w:tc>
+      </w:tr>
+      <w:tr>
+        <w:tc>
+          <w:tcPr>
+            <w:tcW w:type="dxa" w:w="1701"/>
+          </w:tcPr>
+          <w:p>
+            <w:r>
+              <w:rPr>
+                <w:sz w:val="18"/>
+              </w:rPr>
+              <w:t>Mock</w:t>
+            </w:r>
+          </w:p>
+        </w:tc>
+        <w:tc>
+          <w:tcPr>
+            <w:tcW w:type="dxa" w:w="7370"/>
+          </w:tcPr>
+          <w:p>
+            <w:r>
+              <w:rPr>
+                <w:sz w:val="18"/>
+              </w:rPr>
+              <w:t>否</w:t>
+            </w:r>
+          </w:p>
+        </w:tc>
+      </w:tr>
+    </w:tbl>
+    <w:p/>
+    <w:p>
+      <w:pPr>
+        <w:jc w:val="center"/>
+      </w:pPr>
+      <w:r>
+        <w:drawing>
+          <wp:inline xmlns:a="http://schemas.openxmlformats.org/drawingml/2006/main" xmlns:pic="http://schemas.openxmlformats.org/drawingml/2006/picture">
+            <wp:extent cx="5029200" cy="3143250"/>
+            <wp:docPr id="9" name="Picture 9"/>
+            <wp:cNvGraphicFramePr>
+              <a:graphicFrameLocks noChangeAspect="1"/>
+            </wp:cNvGraphicFramePr>
+            <a:graphic>
+              <a:graphicData uri="http://schemas.openxmlformats.org/drawingml/2006/picture">
+                <pic:pic>
+                  <pic:nvPicPr>
+                    <pic:cNvPr id="0" name="offer-risk-detail-drawer-closing-plan_u.png"/>
+                    <pic:cNvPicPr/>
+                  </pic:nvPicPr>
+                  <pic:blipFill>
+                    <a:blip r:embed="rId17"/>
+                    <a:stretch>
+                      <a:fillRect/>
+                    </a:stretch>
+                  </pic:blipFill>
+                  <pic:spPr>
+                    <a:xfrm>
+                      <a:off x="0" y="0"/>
+                      <a:ext cx="5029200" cy="3143250"/>
+                    </a:xfrm>
+                    <a:prstGeom prst="rect"/>
+                  </pic:spPr>
+                </pic:pic>
+              </a:graphicData>
+            </a:graphic>
+          </wp:inline>
+        </w:drawing>
+      </w:r>
+    </w:p>
+    <w:p/>
+    <w:p>
+      <w:pPr>
+        <w:pStyle w:val="Heading2"/>
+      </w:pPr>
+      <w:r>
+        <w:t>10. [Drawer] Actions</w:t>
+      </w:r>
+    </w:p>
+    <w:tbl>
+      <w:tblPr>
+        <w:tblStyle w:val="TableGrid"/>
+        <w:tblW w:type="auto" w:w="0"/>
+        <w:jc w:val="center"/>
+        <w:tblLook w:firstColumn="1" w:firstRow="1" w:lastColumn="0" w:lastRow="0" w:noHBand="0" w:noVBand="1" w:val="04A0"/>
+      </w:tblPr>
+      <w:tblGrid>
+        <w:gridCol w:w="4320"/>
+        <w:gridCol w:w="4320"/>
+      </w:tblGrid>
+      <w:tr>
+        <w:tc>
+          <w:tcPr>
+            <w:tcW w:type="dxa" w:w="1701"/>
+            <w:shd w:val="clear" w:color="auto" w:fill="2B579A"/>
+          </w:tcPr>
+          <w:p>
+            <w:pPr>
+              <w:jc w:val="center"/>
+            </w:pPr>
+            <w:r>
+              <w:rPr>
+                <w:b/>
+                <w:color w:val="FFFFFF"/>
+                <w:sz w:val="20"/>
+              </w:rPr>
+              <w:t>属性</w:t>
+            </w:r>
+          </w:p>
+        </w:tc>
+        <w:tc>
+          <w:tcPr>
+            <w:tcW w:type="dxa" w:w="7370"/>
+            <w:shd w:val="clear" w:color="auto" w:fill="2B579A"/>
+          </w:tcPr>
+          <w:p>
+            <w:pPr>
+              <w:jc w:val="center"/>
+            </w:pPr>
+            <w:r>
+              <w:rPr>
+                <w:b/>
+                <w:color w:val="FFFFFF"/>
+                <w:sz w:val="20"/>
+              </w:rPr>
+              <w:t>值</w:t>
+            </w:r>
+          </w:p>
+        </w:tc>
+      </w:tr>
+      <w:tr>
+        <w:tc>
+          <w:tcPr>
+            <w:tcW w:type="dxa" w:w="1701"/>
+            <w:shd w:val="clear" w:color="auto" w:fill="F2F6FC"/>
+          </w:tcPr>
+          <w:p>
+            <w:r>
+              <w:rPr>
+                <w:sz w:val="18"/>
+              </w:rPr>
+              <w:t>文件名</w:t>
+            </w:r>
+          </w:p>
+        </w:tc>
+        <w:tc>
+          <w:tcPr>
+            <w:tcW w:type="dxa" w:w="7370"/>
+            <w:shd w:val="clear" w:color="auto" w:fill="F2F6FC"/>
+          </w:tcPr>
+          <w:p>
+            <w:r>
+              <w:rPr>
+                <w:sz w:val="18"/>
+              </w:rPr>
+              <w:t>offer-risk-detail-drawer-actions.png</w:t>
+            </w:r>
+          </w:p>
+        </w:tc>
+      </w:tr>
+      <w:tr>
+        <w:tc>
+          <w:tcPr>
+            <w:tcW w:type="dxa" w:w="1701"/>
+          </w:tcPr>
+          <w:p>
+            <w:r>
+              <w:rPr>
+                <w:sz w:val="18"/>
+              </w:rPr>
+              <w:t>描述</w:t>
+            </w:r>
+          </w:p>
+        </w:tc>
+        <w:tc>
+          <w:tcPr>
+            <w:tcW w:type="dxa" w:w="7370"/>
+          </w:tcPr>
+          <w:p>
+            <w:r>
+              <w:rPr>
+                <w:sz w:val="18"/>
+              </w:rPr>
+              <w:t>[Drawer] Actions</w:t>
+            </w:r>
+          </w:p>
+        </w:tc>
+      </w:tr>
+      <w:tr>
+        <w:tc>
+          <w:tcPr>
+            <w:tcW w:type="dxa" w:w="1701"/>
+            <w:shd w:val="clear" w:color="auto" w:fill="F2F6FC"/>
+          </w:tcPr>
+          <w:p>
+            <w:r>
+              <w:rPr>
+                <w:sz w:val="18"/>
+              </w:rPr>
+              <w:t>验证</w:t>
+            </w:r>
+          </w:p>
+        </w:tc>
+        <w:tc>
+          <w:tcPr>
+            <w:tcW w:type="dxa" w:w="7370"/>
+            <w:shd w:val="clear" w:color="auto" w:fill="F2F6FC"/>
+          </w:tcPr>
+          <w:p>
+            <w:r>
+              <w:rPr>
+                <w:sz w:val="18"/>
+              </w:rPr>
+              <w:t>行动项列表(不直接Resolve)</w:t>
+            </w:r>
+          </w:p>
+        </w:tc>
+      </w:tr>
+      <w:tr>
+        <w:tc>
+          <w:tcPr>
+            <w:tcW w:type="dxa" w:w="1701"/>
+          </w:tcPr>
+          <w:p>
+            <w:r>
+              <w:rPr>
+                <w:sz w:val="18"/>
+              </w:rPr>
+              <w:t>Mock</w:t>
+            </w:r>
+          </w:p>
+        </w:tc>
+        <w:tc>
+          <w:tcPr>
+            <w:tcW w:type="dxa" w:w="7370"/>
+          </w:tcPr>
+          <w:p>
+            <w:r>
+              <w:rPr>
+                <w:sz w:val="18"/>
+              </w:rPr>
+              <w:t>否</w:t>
+            </w:r>
+          </w:p>
+        </w:tc>
+      </w:tr>
+    </w:tbl>
+    <w:p/>
+    <w:p>
+      <w:pPr>
+        <w:jc w:val="center"/>
+      </w:pPr>
+      <w:r>
+        <w:drawing>
+          <wp:inline xmlns:a="http://schemas.openxmlformats.org/drawingml/2006/main" xmlns:pic="http://schemas.openxmlformats.org/drawingml/2006/picture">
+            <wp:extent cx="5029200" cy="3143250"/>
+            <wp:docPr id="10" name="Picture 10"/>
+            <wp:cNvGraphicFramePr>
+              <a:graphicFrameLocks noChangeAspect="1"/>
+            </wp:cNvGraphicFramePr>
+            <a:graphic>
+              <a:graphicData uri="http://schemas.openxmlformats.org/drawingml/2006/picture">
+                <pic:pic>
+                  <pic:nvPicPr>
+                    <pic:cNvPr id="0" name="offer-risk-detail-drawer-actions_u.png"/>
+                    <pic:cNvPicPr/>
+                  </pic:nvPicPr>
+                  <pic:blipFill>
+                    <a:blip r:embed="rId18"/>
+                    <a:stretch>
+                      <a:fillRect/>
+                    </a:stretch>
+                  </pic:blipFill>
+                  <pic:spPr>
+                    <a:xfrm>
+                      <a:off x="0" y="0"/>
+                      <a:ext cx="5029200" cy="3143250"/>
+                    </a:xfrm>
+                    <a:prstGeom prst="rect"/>
+                  </pic:spPr>
+                </pic:pic>
+              </a:graphicData>
+            </a:graphic>
+          </wp:inline>
+        </w:drawing>
+      </w:r>
+    </w:p>
+    <w:p/>
+    <w:p>
+      <w:pPr>
+        <w:pStyle w:val="Heading2"/>
+      </w:pPr>
+      <w:r>
+        <w:t>11. [Drawer] Insights</w:t>
+      </w:r>
+    </w:p>
+    <w:tbl>
+      <w:tblPr>
+        <w:tblStyle w:val="TableGrid"/>
+        <w:tblW w:type="auto" w:w="0"/>
+        <w:jc w:val="center"/>
+        <w:tblLook w:firstColumn="1" w:firstRow="1" w:lastColumn="0" w:lastRow="0" w:noHBand="0" w:noVBand="1" w:val="04A0"/>
+      </w:tblPr>
+      <w:tblGrid>
+        <w:gridCol w:w="4320"/>
+        <w:gridCol w:w="4320"/>
+      </w:tblGrid>
+      <w:tr>
+        <w:tc>
+          <w:tcPr>
+            <w:tcW w:type="dxa" w:w="1701"/>
+            <w:shd w:val="clear" w:color="auto" w:fill="2B579A"/>
+          </w:tcPr>
+          <w:p>
+            <w:pPr>
+              <w:jc w:val="center"/>
+            </w:pPr>
+            <w:r>
+              <w:rPr>
+                <w:b/>
+                <w:color w:val="FFFFFF"/>
+                <w:sz w:val="20"/>
+              </w:rPr>
+              <w:t>属性</w:t>
+            </w:r>
+          </w:p>
+        </w:tc>
+        <w:tc>
+          <w:tcPr>
+            <w:tcW w:type="dxa" w:w="7370"/>
+            <w:shd w:val="clear" w:color="auto" w:fill="2B579A"/>
+          </w:tcPr>
+          <w:p>
+            <w:pPr>
+              <w:jc w:val="center"/>
+            </w:pPr>
+            <w:r>
+              <w:rPr>
+                <w:b/>
+                <w:color w:val="FFFFFF"/>
+                <w:sz w:val="20"/>
+              </w:rPr>
+              <w:t>值</w:t>
+            </w:r>
+          </w:p>
+        </w:tc>
+      </w:tr>
+      <w:tr>
+        <w:tc>
+          <w:tcPr>
+            <w:tcW w:type="dxa" w:w="1701"/>
+            <w:shd w:val="clear" w:color="auto" w:fill="F2F6FC"/>
+          </w:tcPr>
+          <w:p>
+            <w:r>
+              <w:rPr>
+                <w:sz w:val="18"/>
+              </w:rPr>
+              <w:t>文件名</w:t>
+            </w:r>
+          </w:p>
+        </w:tc>
+        <w:tc>
+          <w:tcPr>
+            <w:tcW w:type="dxa" w:w="7370"/>
+            <w:shd w:val="clear" w:color="auto" w:fill="F2F6FC"/>
+          </w:tcPr>
+          <w:p>
+            <w:r>
+              <w:rPr>
+                <w:sz w:val="18"/>
+              </w:rPr>
+              <w:t>offer-risk-detail-drawer-insights.png</w:t>
+            </w:r>
+          </w:p>
+        </w:tc>
+      </w:tr>
+      <w:tr>
+        <w:tc>
+          <w:tcPr>
+            <w:tcW w:type="dxa" w:w="1701"/>
+          </w:tcPr>
+          <w:p>
+            <w:r>
+              <w:rPr>
+                <w:sz w:val="18"/>
+              </w:rPr>
+              <w:t>描述</w:t>
+            </w:r>
+          </w:p>
+        </w:tc>
+        <w:tc>
+          <w:tcPr>
+            <w:tcW w:type="dxa" w:w="7370"/>
+          </w:tcPr>
+          <w:p>
+            <w:r>
+              <w:rPr>
+                <w:sz w:val="18"/>
+              </w:rPr>
+              <w:t>[Drawer] Insights</w:t>
+            </w:r>
+          </w:p>
+        </w:tc>
+      </w:tr>
+      <w:tr>
+        <w:tc>
+          <w:tcPr>
+            <w:tcW w:type="dxa" w:w="1701"/>
+            <w:shd w:val="clear" w:color="auto" w:fill="F2F6FC"/>
+          </w:tcPr>
+          <w:p>
+            <w:r>
+              <w:rPr>
+                <w:sz w:val="18"/>
+              </w:rPr>
+              <w:t>验证</w:t>
+            </w:r>
+          </w:p>
+        </w:tc>
+        <w:tc>
+          <w:tcPr>
+            <w:tcW w:type="dxa" w:w="7370"/>
+            <w:shd w:val="clear" w:color="auto" w:fill="F2F6FC"/>
+          </w:tcPr>
+          <w:p>
+            <w:r>
+              <w:rPr>
+                <w:sz w:val="18"/>
+              </w:rPr>
+              <w:t>系统洞察: system_rule+evidence+suggestedAction</w:t>
+            </w:r>
+          </w:p>
+        </w:tc>
+      </w:tr>
+      <w:tr>
+        <w:tc>
+          <w:tcPr>
+            <w:tcW w:type="dxa" w:w="1701"/>
+          </w:tcPr>
+          <w:p>
+            <w:r>
+              <w:rPr>
+                <w:sz w:val="18"/>
+              </w:rPr>
+              <w:t>Mock</w:t>
+            </w:r>
+          </w:p>
+        </w:tc>
+        <w:tc>
+          <w:tcPr>
+            <w:tcW w:type="dxa" w:w="7370"/>
+          </w:tcPr>
+          <w:p>
+            <w:r>
+              <w:rPr>
+                <w:sz w:val="18"/>
+              </w:rPr>
+              <w:t>否</w:t>
+            </w:r>
+          </w:p>
+        </w:tc>
+      </w:tr>
+    </w:tbl>
+    <w:p/>
+    <w:p>
+      <w:pPr>
+        <w:jc w:val="center"/>
+      </w:pPr>
+      <w:r>
+        <w:drawing>
+          <wp:inline xmlns:a="http://schemas.openxmlformats.org/drawingml/2006/main" xmlns:pic="http://schemas.openxmlformats.org/drawingml/2006/picture">
+            <wp:extent cx="5029200" cy="3143250"/>
+            <wp:docPr id="11" name="Picture 11"/>
+            <wp:cNvGraphicFramePr>
+              <a:graphicFrameLocks noChangeAspect="1"/>
+            </wp:cNvGraphicFramePr>
+            <a:graphic>
+              <a:graphicData uri="http://schemas.openxmlformats.org/drawingml/2006/picture">
+                <pic:pic>
+                  <pic:nvPicPr>
+                    <pic:cNvPr id="0" name="offer-risk-detail-drawer-insights_u.png"/>
+                    <pic:cNvPicPr/>
+                  </pic:nvPicPr>
+                  <pic:blipFill>
+                    <a:blip r:embed="rId19"/>
+                    <a:stretch>
+                      <a:fillRect/>
+                    </a:stretch>
+                  </pic:blipFill>
+                  <pic:spPr>
+                    <a:xfrm>
+                      <a:off x="0" y="0"/>
+                      <a:ext cx="5029200" cy="3143250"/>
+                    </a:xfrm>
+                    <a:prstGeom prst="rect"/>
+                  </pic:spPr>
+                </pic:pic>
+              </a:graphicData>
+            </a:graphic>
+          </wp:inline>
+        </w:drawing>
+      </w:r>
+    </w:p>
+    <w:p/>
+    <w:p>
+      <w:pPr>
+        <w:pStyle w:val="Heading2"/>
+      </w:pPr>
+      <w:r>
+        <w:t>12. [Drawer] Activity</w:t>
+      </w:r>
+    </w:p>
+    <w:tbl>
+      <w:tblPr>
+        <w:tblStyle w:val="TableGrid"/>
+        <w:tblW w:type="auto" w:w="0"/>
+        <w:jc w:val="center"/>
+        <w:tblLook w:firstColumn="1" w:firstRow="1" w:lastColumn="0" w:lastRow="0" w:noHBand="0" w:noVBand="1" w:val="04A0"/>
+      </w:tblPr>
+      <w:tblGrid>
+        <w:gridCol w:w="4320"/>
+        <w:gridCol w:w="4320"/>
+      </w:tblGrid>
+      <w:tr>
+        <w:tc>
+          <w:tcPr>
+            <w:tcW w:type="dxa" w:w="1701"/>
+            <w:shd w:val="clear" w:color="auto" w:fill="2B579A"/>
+          </w:tcPr>
+          <w:p>
+            <w:pPr>
+              <w:jc w:val="center"/>
+            </w:pPr>
+            <w:r>
+              <w:rPr>
+                <w:b/>
+                <w:color w:val="FFFFFF"/>
+                <w:sz w:val="20"/>
+              </w:rPr>
+              <w:t>属性</w:t>
+            </w:r>
+          </w:p>
+        </w:tc>
+        <w:tc>
+          <w:tcPr>
+            <w:tcW w:type="dxa" w:w="7370"/>
+            <w:shd w:val="clear" w:color="auto" w:fill="2B579A"/>
+          </w:tcPr>
+          <w:p>
+            <w:pPr>
+              <w:jc w:val="center"/>
+            </w:pPr>
+            <w:r>
+              <w:rPr>
+                <w:b/>
+                <w:color w:val="FFFFFF"/>
+                <w:sz w:val="20"/>
+              </w:rPr>
+              <w:t>值</w:t>
+            </w:r>
+          </w:p>
+        </w:tc>
+      </w:tr>
+      <w:tr>
+        <w:tc>
+          <w:tcPr>
+            <w:tcW w:type="dxa" w:w="1701"/>
+            <w:shd w:val="clear" w:color="auto" w:fill="F2F6FC"/>
+          </w:tcPr>
+          <w:p>
+            <w:r>
+              <w:rPr>
+                <w:sz w:val="18"/>
+              </w:rPr>
+              <w:t>文件名</w:t>
+            </w:r>
+          </w:p>
+        </w:tc>
+        <w:tc>
+          <w:tcPr>
+            <w:tcW w:type="dxa" w:w="7370"/>
+            <w:shd w:val="clear" w:color="auto" w:fill="F2F6FC"/>
+          </w:tcPr>
+          <w:p>
+            <w:r>
+              <w:rPr>
+                <w:sz w:val="18"/>
+              </w:rPr>
+              <w:t>offer-risk-detail-drawer-activity.png</w:t>
+            </w:r>
+          </w:p>
+        </w:tc>
+      </w:tr>
+      <w:tr>
+        <w:tc>
+          <w:tcPr>
+            <w:tcW w:type="dxa" w:w="1701"/>
+          </w:tcPr>
+          <w:p>
+            <w:r>
+              <w:rPr>
+                <w:sz w:val="18"/>
+              </w:rPr>
+              <w:t>描述</w:t>
+            </w:r>
+          </w:p>
+        </w:tc>
+        <w:tc>
+          <w:tcPr>
+            <w:tcW w:type="dxa" w:w="7370"/>
+          </w:tcPr>
+          <w:p>
+            <w:r>
+              <w:rPr>
+                <w:sz w:val="18"/>
+              </w:rPr>
+              <w:t>[Drawer] Activity</w:t>
+            </w:r>
+          </w:p>
+        </w:tc>
+      </w:tr>
+      <w:tr>
+        <w:tc>
+          <w:tcPr>
+            <w:tcW w:type="dxa" w:w="1701"/>
+            <w:shd w:val="clear" w:color="auto" w:fill="F2F6FC"/>
+          </w:tcPr>
+          <w:p>
+            <w:r>
+              <w:rPr>
+                <w:sz w:val="18"/>
+              </w:rPr>
+              <w:t>验证</w:t>
+            </w:r>
+          </w:p>
+        </w:tc>
+        <w:tc>
+          <w:tcPr>
+            <w:tcW w:type="dxa" w:w="7370"/>
+            <w:shd w:val="clear" w:color="auto" w:fill="F2F6FC"/>
+          </w:tcPr>
+          <w:p>
+            <w:r>
+              <w:rPr>
+                <w:sz w:val="18"/>
+              </w:rPr>
+              <w:t>动态记录: 人话化文案</w:t>
+            </w:r>
+          </w:p>
+        </w:tc>
+      </w:tr>
+      <w:tr>
+        <w:tc>
+          <w:tcPr>
+            <w:tcW w:type="dxa" w:w="1701"/>
+          </w:tcPr>
+          <w:p>
+            <w:r>
+              <w:rPr>
+                <w:sz w:val="18"/>
+              </w:rPr>
+              <w:t>Mock</w:t>
+            </w:r>
+          </w:p>
+        </w:tc>
+        <w:tc>
+          <w:tcPr>
+            <w:tcW w:type="dxa" w:w="7370"/>
+          </w:tcPr>
+          <w:p>
+            <w:r>
+              <w:rPr>
+                <w:sz w:val="18"/>
+              </w:rPr>
+              <w:t>否</w:t>
+            </w:r>
+          </w:p>
+        </w:tc>
+      </w:tr>
+    </w:tbl>
+    <w:p/>
+    <w:p>
+      <w:pPr>
+        <w:jc w:val="center"/>
+      </w:pPr>
+      <w:r>
+        <w:drawing>
+          <wp:inline xmlns:a="http://schemas.openxmlformats.org/drawingml/2006/main" xmlns:pic="http://schemas.openxmlformats.org/drawingml/2006/picture">
+            <wp:extent cx="5029200" cy="3143250"/>
+            <wp:docPr id="12" name="Picture 12"/>
+            <wp:cNvGraphicFramePr>
+              <a:graphicFrameLocks noChangeAspect="1"/>
+            </wp:cNvGraphicFramePr>
+            <a:graphic>
+              <a:graphicData uri="http://schemas.openxmlformats.org/drawingml/2006/picture">
+                <pic:pic>
+                  <pic:nvPicPr>
+                    <pic:cNvPr id="0" name="offer-risk-detail-drawer-activity_u.png"/>
+                    <pic:cNvPicPr/>
+                  </pic:nvPicPr>
+                  <pic:blipFill>
+                    <a:blip r:embed="rId20"/>
+                    <a:stretch>
+                      <a:fillRect/>
+                    </a:stretch>
+                  </pic:blipFill>
+                  <pic:spPr>
+                    <a:xfrm>
+                      <a:off x="0" y="0"/>
+                      <a:ext cx="5029200" cy="3143250"/>
+                    </a:xfrm>
+                    <a:prstGeom prst="rect"/>
+                  </pic:spPr>
+                </pic:pic>
+              </a:graphicData>
+            </a:graphic>
+          </wp:inline>
+        </w:drawing>
+      </w:r>
+    </w:p>
+    <w:p/>
+    <w:p>
+      <w:pPr>
+        <w:pStyle w:val="Heading2"/>
+      </w:pPr>
+      <w:r>
+        <w:t>13. [Provenance]</w:t>
+      </w:r>
+    </w:p>
+    <w:tbl>
+      <w:tblPr>
+        <w:tblStyle w:val="TableGrid"/>
+        <w:tblW w:type="auto" w:w="0"/>
+        <w:jc w:val="center"/>
+        <w:tblLook w:firstColumn="1" w:firstRow="1" w:lastColumn="0" w:lastRow="0" w:noHBand="0" w:noVBand="1" w:val="04A0"/>
+      </w:tblPr>
+      <w:tblGrid>
+        <w:gridCol w:w="4320"/>
+        <w:gridCol w:w="4320"/>
+      </w:tblGrid>
+      <w:tr>
+        <w:tc>
+          <w:tcPr>
+            <w:tcW w:type="dxa" w:w="1701"/>
+            <w:shd w:val="clear" w:color="auto" w:fill="2B579A"/>
+          </w:tcPr>
+          <w:p>
+            <w:pPr>
+              <w:jc w:val="center"/>
+            </w:pPr>
+            <w:r>
+              <w:rPr>
+                <w:b/>
+                <w:color w:val="FFFFFF"/>
+                <w:sz w:val="20"/>
+              </w:rPr>
+              <w:t>属性</w:t>
+            </w:r>
+          </w:p>
+        </w:tc>
+        <w:tc>
+          <w:tcPr>
+            <w:tcW w:type="dxa" w:w="7370"/>
+            <w:shd w:val="clear" w:color="auto" w:fill="2B579A"/>
+          </w:tcPr>
+          <w:p>
+            <w:pPr>
+              <w:jc w:val="center"/>
+            </w:pPr>
+            <w:r>
+              <w:rPr>
+                <w:b/>
+                <w:color w:val="FFFFFF"/>
+                <w:sz w:val="20"/>
+              </w:rPr>
+              <w:t>值</w:t>
+            </w:r>
+          </w:p>
+        </w:tc>
+      </w:tr>
+      <w:tr>
+        <w:tc>
+          <w:tcPr>
+            <w:tcW w:type="dxa" w:w="1701"/>
+            <w:shd w:val="clear" w:color="auto" w:fill="F2F6FC"/>
+          </w:tcPr>
+          <w:p>
+            <w:r>
+              <w:rPr>
+                <w:sz w:val="18"/>
+              </w:rPr>
+              <w:t>文件名</w:t>
+            </w:r>
+          </w:p>
+        </w:tc>
+        <w:tc>
+          <w:tcPr>
+            <w:tcW w:type="dxa" w:w="7370"/>
+            <w:shd w:val="clear" w:color="auto" w:fill="F2F6FC"/>
+          </w:tcPr>
+          <w:p>
+            <w:r>
+              <w:rPr>
+                <w:sz w:val="18"/>
+              </w:rPr>
+              <w:t>offer-risk-insight-provenance-readable.png</w:t>
+            </w:r>
+          </w:p>
+        </w:tc>
+      </w:tr>
+      <w:tr>
+        <w:tc>
+          <w:tcPr>
+            <w:tcW w:type="dxa" w:w="1701"/>
+          </w:tcPr>
+          <w:p>
+            <w:r>
+              <w:rPr>
+                <w:sz w:val="18"/>
+              </w:rPr>
+              <w:t>描述</w:t>
+            </w:r>
+          </w:p>
+        </w:tc>
+        <w:tc>
+          <w:tcPr>
+            <w:tcW w:type="dxa" w:w="7370"/>
+          </w:tcPr>
+          <w:p>
+            <w:r>
+              <w:rPr>
+                <w:sz w:val="18"/>
+              </w:rPr>
+              <w:t>[Provenance]</w:t>
+            </w:r>
+          </w:p>
+        </w:tc>
+      </w:tr>
+      <w:tr>
+        <w:tc>
+          <w:tcPr>
+            <w:tcW w:type="dxa" w:w="1701"/>
+            <w:shd w:val="clear" w:color="auto" w:fill="F2F6FC"/>
+          </w:tcPr>
+          <w:p>
+            <w:r>
+              <w:rPr>
+                <w:sz w:val="18"/>
+              </w:rPr>
+              <w:t>验证</w:t>
+            </w:r>
+          </w:p>
+        </w:tc>
+        <w:tc>
+          <w:tcPr>
+            <w:tcW w:type="dxa" w:w="7370"/>
+            <w:shd w:val="clear" w:color="auto" w:fill="F2F6FC"/>
+          </w:tcPr>
+          <w:p>
+            <w:r>
+              <w:rPr>
+                <w:sz w:val="18"/>
+              </w:rPr>
+              <w:t>系统规则提醒+触发条件+证据</w:t>
+            </w:r>
+          </w:p>
+        </w:tc>
+      </w:tr>
+      <w:tr>
+        <w:tc>
+          <w:tcPr>
+            <w:tcW w:type="dxa" w:w="1701"/>
+          </w:tcPr>
+          <w:p>
+            <w:r>
+              <w:rPr>
+                <w:sz w:val="18"/>
+              </w:rPr>
+              <w:t>Mock</w:t>
+            </w:r>
+          </w:p>
+        </w:tc>
+        <w:tc>
+          <w:tcPr>
+            <w:tcW w:type="dxa" w:w="7370"/>
+          </w:tcPr>
+          <w:p>
+            <w:r>
+              <w:rPr>
+                <w:sz w:val="18"/>
+              </w:rPr>
+              <w:t>否</w:t>
+            </w:r>
+          </w:p>
+        </w:tc>
+      </w:tr>
+    </w:tbl>
+    <w:p/>
+    <w:p>
+      <w:pPr>
+        <w:jc w:val="center"/>
+      </w:pPr>
+      <w:r>
+        <w:drawing>
+          <wp:inline xmlns:a="http://schemas.openxmlformats.org/drawingml/2006/main" xmlns:pic="http://schemas.openxmlformats.org/drawingml/2006/picture">
+            <wp:extent cx="5029200" cy="3143250"/>
+            <wp:docPr id="13" name="Picture 13"/>
+            <wp:cNvGraphicFramePr>
+              <a:graphicFrameLocks noChangeAspect="1"/>
+            </wp:cNvGraphicFramePr>
+            <a:graphic>
+              <a:graphicData uri="http://schemas.openxmlformats.org/drawingml/2006/picture">
+                <pic:pic>
+                  <pic:nvPicPr>
+                    <pic:cNvPr id="0" name="offer-risk-insight-provenance-readable_u.png"/>
+                    <pic:cNvPicPr/>
+                  </pic:nvPicPr>
+                  <pic:blipFill>
+                    <a:blip r:embed="rId21"/>
+                    <a:stretch>
+                      <a:fillRect/>
+                    </a:stretch>
+                  </pic:blipFill>
+                  <pic:spPr>
+                    <a:xfrm>
+                      <a:off x="0" y="0"/>
+                      <a:ext cx="5029200" cy="3143250"/>
+                    </a:xfrm>
+                    <a:prstGeom prst="rect"/>
+                  </pic:spPr>
+                </pic:pic>
+              </a:graphicData>
+            </a:graphic>
+          </wp:inline>
+        </w:drawing>
+      </w:r>
+    </w:p>
+    <w:p/>
+    <w:p>
+      <w:pPr>
+        <w:pStyle w:val="Heading2"/>
+      </w:pPr>
+      <w:r>
+        <w:t>14. [Permission] Interviewer 403</w:t>
+      </w:r>
+    </w:p>
+    <w:tbl>
+      <w:tblPr>
+        <w:tblStyle w:val="TableGrid"/>
+        <w:tblW w:type="auto" w:w="0"/>
+        <w:jc w:val="center"/>
+        <w:tblLook w:firstColumn="1" w:firstRow="1" w:lastColumn="0" w:lastRow="0" w:noHBand="0" w:noVBand="1" w:val="04A0"/>
+      </w:tblPr>
+      <w:tblGrid>
+        <w:gridCol w:w="4320"/>
+        <w:gridCol w:w="4320"/>
+      </w:tblGrid>
+      <w:tr>
+        <w:tc>
+          <w:tcPr>
+            <w:tcW w:type="dxa" w:w="1701"/>
+            <w:shd w:val="clear" w:color="auto" w:fill="2B579A"/>
+          </w:tcPr>
+          <w:p>
+            <w:pPr>
+              <w:jc w:val="center"/>
+            </w:pPr>
+            <w:r>
+              <w:rPr>
+                <w:b/>
+                <w:color w:val="FFFFFF"/>
+                <w:sz w:val="20"/>
+              </w:rPr>
+              <w:t>属性</w:t>
+            </w:r>
+          </w:p>
+        </w:tc>
+        <w:tc>
+          <w:tcPr>
+            <w:tcW w:type="dxa" w:w="7370"/>
+            <w:shd w:val="clear" w:color="auto" w:fill="2B579A"/>
+          </w:tcPr>
+          <w:p>
+            <w:pPr>
+              <w:jc w:val="center"/>
+            </w:pPr>
+            <w:r>
+              <w:rPr>
+                <w:b/>
+                <w:color w:val="FFFFFF"/>
+                <w:sz w:val="20"/>
+              </w:rPr>
+              <w:t>值</w:t>
+            </w:r>
+          </w:p>
+        </w:tc>
+      </w:tr>
+      <w:tr>
+        <w:tc>
+          <w:tcPr>
+            <w:tcW w:type="dxa" w:w="1701"/>
+            <w:shd w:val="clear" w:color="auto" w:fill="F2F6FC"/>
+          </w:tcPr>
+          <w:p>
+            <w:r>
+              <w:rPr>
+                <w:sz w:val="18"/>
+              </w:rPr>
+              <w:t>文件名</w:t>
+            </w:r>
+          </w:p>
+        </w:tc>
+        <w:tc>
+          <w:tcPr>
+            <w:tcW w:type="dxa" w:w="7370"/>
+            <w:shd w:val="clear" w:color="auto" w:fill="F2F6FC"/>
+          </w:tcPr>
+          <w:p>
+            <w:r>
+              <w:rPr>
+                <w:sz w:val="18"/>
+              </w:rPr>
+              <w:t>offer-risk-permission-denied.png</w:t>
+            </w:r>
+          </w:p>
+        </w:tc>
+      </w:tr>
+      <w:tr>
+        <w:tc>
+          <w:tcPr>
+            <w:tcW w:type="dxa" w:w="1701"/>
+          </w:tcPr>
+          <w:p>
+            <w:r>
+              <w:rPr>
+                <w:sz w:val="18"/>
+              </w:rPr>
+              <w:t>描述</w:t>
+            </w:r>
+          </w:p>
+        </w:tc>
+        <w:tc>
+          <w:tcPr>
+            <w:tcW w:type="dxa" w:w="7370"/>
+          </w:tcPr>
+          <w:p>
+            <w:r>
+              <w:rPr>
+                <w:sz w:val="18"/>
+              </w:rPr>
+              <w:t>[Permission] Interviewer 403</w:t>
+            </w:r>
+          </w:p>
+        </w:tc>
+      </w:tr>
+      <w:tr>
+        <w:tc>
+          <w:tcPr>
+            <w:tcW w:type="dxa" w:w="1701"/>
+            <w:shd w:val="clear" w:color="auto" w:fill="F2F6FC"/>
+          </w:tcPr>
+          <w:p>
+            <w:r>
+              <w:rPr>
+                <w:sz w:val="18"/>
+              </w:rPr>
+              <w:t>验证</w:t>
+            </w:r>
+          </w:p>
+        </w:tc>
+        <w:tc>
+          <w:tcPr>
+            <w:tcW w:type="dxa" w:w="7370"/>
+            <w:shd w:val="clear" w:color="auto" w:fill="F2F6FC"/>
+          </w:tcPr>
+          <w:p>
+            <w:r>
+              <w:rPr>
+                <w:sz w:val="18"/>
+              </w:rPr>
+              <w:t>权限拒绝</w:t>
+            </w:r>
+          </w:p>
+        </w:tc>
+      </w:tr>
+      <w:tr>
+        <w:tc>
+          <w:tcPr>
+            <w:tcW w:type="dxa" w:w="1701"/>
+          </w:tcPr>
+          <w:p>
+            <w:r>
+              <w:rPr>
+                <w:sz w:val="18"/>
+              </w:rPr>
+              <w:t>Mock</w:t>
+            </w:r>
+          </w:p>
+        </w:tc>
+        <w:tc>
+          <w:tcPr>
+            <w:tcW w:type="dxa" w:w="7370"/>
+          </w:tcPr>
+          <w:p>
+            <w:r>
+              <w:rPr>
+                <w:sz w:val="18"/>
+              </w:rPr>
+              <w:t>否</w:t>
+            </w:r>
+          </w:p>
+        </w:tc>
+      </w:tr>
+    </w:tbl>
+    <w:p/>
+    <w:p>
+      <w:pPr>
+        <w:jc w:val="center"/>
+      </w:pPr>
+      <w:r>
+        <w:drawing>
+          <wp:inline xmlns:a="http://schemas.openxmlformats.org/drawingml/2006/main" xmlns:pic="http://schemas.openxmlformats.org/drawingml/2006/picture">
+            <wp:extent cx="5029200" cy="3143250"/>
+            <wp:docPr id="14" name="Picture 14"/>
+            <wp:cNvGraphicFramePr>
+              <a:graphicFrameLocks noChangeAspect="1"/>
+            </wp:cNvGraphicFramePr>
+            <a:graphic>
+              <a:graphicData uri="http://schemas.openxmlformats.org/drawingml/2006/picture">
+                <pic:pic>
+                  <pic:nvPicPr>
+                    <pic:cNvPr id="0" name="offer-risk-permission-denied_u.png"/>
+                    <pic:cNvPicPr/>
+                  </pic:nvPicPr>
+                  <pic:blipFill>
+                    <a:blip r:embed="rId22"/>
+                    <a:stretch>
+                      <a:fillRect/>
+                    </a:stretch>
+                  </pic:blipFill>
+                  <pic:spPr>
+                    <a:xfrm>
+                      <a:off x="0" y="0"/>
+                      <a:ext cx="5029200" cy="3143250"/>
+                    </a:xfrm>
+                    <a:prstGeom prst="rect"/>
+                  </pic:spPr>
+                </pic:pic>
+              </a:graphicData>
+            </a:graphic>
+          </wp:inline>
+        </w:drawing>
+      </w:r>
+    </w:p>
+    <w:p/>
+    <w:p>
+      <w:pPr>
+        <w:pStyle w:val="Heading2"/>
+      </w:pPr>
+      <w:r>
+        <w:t>15. [Verify] Action Center</w:t>
+      </w:r>
+    </w:p>
+    <w:tbl>
+      <w:tblPr>
+        <w:tblStyle w:val="TableGrid"/>
+        <w:tblW w:type="auto" w:w="0"/>
+        <w:jc w:val="center"/>
+        <w:tblLook w:firstColumn="1" w:firstRow="1" w:lastColumn="0" w:lastRow="0" w:noHBand="0" w:noVBand="1" w:val="04A0"/>
+      </w:tblPr>
+      <w:tblGrid>
+        <w:gridCol w:w="4320"/>
+        <w:gridCol w:w="4320"/>
+      </w:tblGrid>
+      <w:tr>
+        <w:tc>
+          <w:tcPr>
+            <w:tcW w:type="dxa" w:w="1701"/>
+            <w:shd w:val="clear" w:color="auto" w:fill="2B579A"/>
+          </w:tcPr>
+          <w:p>
+            <w:pPr>
+              <w:jc w:val="center"/>
+            </w:pPr>
+            <w:r>
+              <w:rPr>
+                <w:b/>
+                <w:color w:val="FFFFFF"/>
+                <w:sz w:val="20"/>
+              </w:rPr>
+              <w:t>属性</w:t>
+            </w:r>
+          </w:p>
+        </w:tc>
+        <w:tc>
+          <w:tcPr>
+            <w:tcW w:type="dxa" w:w="7370"/>
+            <w:shd w:val="clear" w:color="auto" w:fill="2B579A"/>
+          </w:tcPr>
+          <w:p>
+            <w:pPr>
+              <w:jc w:val="center"/>
+            </w:pPr>
+            <w:r>
+              <w:rPr>
+                <w:b/>
+                <w:color w:val="FFFFFF"/>
+                <w:sz w:val="20"/>
+              </w:rPr>
+              <w:t>值</w:t>
+            </w:r>
+          </w:p>
+        </w:tc>
+      </w:tr>
+      <w:tr>
+        <w:tc>
+          <w:tcPr>
+            <w:tcW w:type="dxa" w:w="1701"/>
+            <w:shd w:val="clear" w:color="auto" w:fill="F2F6FC"/>
+          </w:tcPr>
+          <w:p>
+            <w:r>
+              <w:rPr>
+                <w:sz w:val="18"/>
+              </w:rPr>
+              <w:t>文件名</w:t>
+            </w:r>
+          </w:p>
+        </w:tc>
+        <w:tc>
+          <w:tcPr>
+            <w:tcW w:type="dxa" w:w="7370"/>
+            <w:shd w:val="clear" w:color="auto" w:fill="F2F6FC"/>
+          </w:tcPr>
+          <w:p>
+            <w:r>
+              <w:rPr>
+                <w:sz w:val="18"/>
+              </w:rPr>
+              <w:t>action-center-still-works-after-offer-risk.png</w:t>
+            </w:r>
+          </w:p>
+        </w:tc>
+      </w:tr>
+      <w:tr>
+        <w:tc>
+          <w:tcPr>
+            <w:tcW w:type="dxa" w:w="1701"/>
+          </w:tcPr>
+          <w:p>
+            <w:r>
+              <w:rPr>
+                <w:sz w:val="18"/>
+              </w:rPr>
+              <w:t>描述</w:t>
+            </w:r>
+          </w:p>
+        </w:tc>
+        <w:tc>
+          <w:tcPr>
+            <w:tcW w:type="dxa" w:w="7370"/>
+          </w:tcPr>
+          <w:p>
+            <w:r>
+              <w:rPr>
+                <w:sz w:val="18"/>
+              </w:rPr>
+              <w:t>[Verify] Action Center</w:t>
+            </w:r>
+          </w:p>
+        </w:tc>
+      </w:tr>
+      <w:tr>
+        <w:tc>
+          <w:tcPr>
+            <w:tcW w:type="dxa" w:w="1701"/>
+            <w:shd w:val="clear" w:color="auto" w:fill="F2F6FC"/>
+          </w:tcPr>
+          <w:p>
+            <w:r>
+              <w:rPr>
+                <w:sz w:val="18"/>
+              </w:rPr>
+              <w:t>验证</w:t>
+            </w:r>
+          </w:p>
+        </w:tc>
+        <w:tc>
+          <w:tcPr>
+            <w:tcW w:type="dxa" w:w="7370"/>
+            <w:shd w:val="clear" w:color="auto" w:fill="F2F6FC"/>
+          </w:tcPr>
+          <w:p>
+            <w:r>
+              <w:rPr>
+                <w:sz w:val="18"/>
+              </w:rPr>
+              <w:t>未破坏</w:t>
+            </w:r>
+          </w:p>
+        </w:tc>
+      </w:tr>
+      <w:tr>
+        <w:tc>
+          <w:tcPr>
+            <w:tcW w:type="dxa" w:w="1701"/>
+          </w:tcPr>
+          <w:p>
+            <w:r>
+              <w:rPr>
+                <w:sz w:val="18"/>
+              </w:rPr>
+              <w:t>Mock</w:t>
+            </w:r>
+          </w:p>
+        </w:tc>
+        <w:tc>
+          <w:tcPr>
+            <w:tcW w:type="dxa" w:w="7370"/>
+          </w:tcPr>
+          <w:p>
+            <w:r>
+              <w:rPr>
+                <w:sz w:val="18"/>
+              </w:rPr>
+              <w:t>否</w:t>
+            </w:r>
+          </w:p>
+        </w:tc>
+      </w:tr>
+    </w:tbl>
+    <w:p/>
+    <w:p>
+      <w:pPr>
+        <w:jc w:val="center"/>
+      </w:pPr>
+      <w:r>
+        <w:drawing>
+          <wp:inline xmlns:a="http://schemas.openxmlformats.org/drawingml/2006/main" xmlns:pic="http://schemas.openxmlformats.org/drawingml/2006/picture">
+            <wp:extent cx="5029200" cy="3143250"/>
+            <wp:docPr id="15" name="Picture 15"/>
+            <wp:cNvGraphicFramePr>
+              <a:graphicFrameLocks noChangeAspect="1"/>
+            </wp:cNvGraphicFramePr>
+            <a:graphic>
+              <a:graphicData uri="http://schemas.openxmlformats.org/drawingml/2006/picture">
+                <pic:pic>
+                  <pic:nvPicPr>
+                    <pic:cNvPr id="0" name="action-center-still-works-after-offer-risk_u.png"/>
+                    <pic:cNvPicPr/>
+                  </pic:nvPicPr>
+                  <pic:blipFill>
+                    <a:blip r:embed="rId23"/>
+                    <a:stretch>
+                      <a:fillRect/>
+                    </a:stretch>
+                  </pic:blipFill>
+                  <pic:spPr>
+                    <a:xfrm>
+                      <a:off x="0" y="0"/>
+                      <a:ext cx="5029200" cy="3143250"/>
+                    </a:xfrm>
+                    <a:prstGeom prst="rect"/>
+                  </pic:spPr>
+                </pic:pic>
+              </a:graphicData>
+            </a:graphic>
+          </wp:inline>
+        </w:drawing>
+      </w:r>
+    </w:p>
+    <w:p/>
+    <w:p>
+      <w:pPr>
+        <w:pStyle w:val="Heading2"/>
+      </w:pPr>
+      <w:r>
+        <w:t>16. [Verify] Candidate Center</w:t>
+      </w:r>
+    </w:p>
+    <w:tbl>
+      <w:tblPr>
+        <w:tblStyle w:val="TableGrid"/>
+        <w:tblW w:type="auto" w:w="0"/>
+        <w:jc w:val="center"/>
+        <w:tblLook w:firstColumn="1" w:firstRow="1" w:lastColumn="0" w:lastRow="0" w:noHBand="0" w:noVBand="1" w:val="04A0"/>
+      </w:tblPr>
+      <w:tblGrid>
+        <w:gridCol w:w="4320"/>
+        <w:gridCol w:w="4320"/>
+      </w:tblGrid>
+      <w:tr>
+        <w:tc>
+          <w:tcPr>
+            <w:tcW w:type="dxa" w:w="1701"/>
+            <w:shd w:val="clear" w:color="auto" w:fill="2B579A"/>
+          </w:tcPr>
+          <w:p>
+            <w:pPr>
+              <w:jc w:val="center"/>
+            </w:pPr>
+            <w:r>
+              <w:rPr>
+                <w:b/>
+                <w:color w:val="FFFFFF"/>
+                <w:sz w:val="20"/>
+              </w:rPr>
+              <w:t>属性</w:t>
+            </w:r>
+          </w:p>
+        </w:tc>
+        <w:tc>
+          <w:tcPr>
+            <w:tcW w:type="dxa" w:w="7370"/>
+            <w:shd w:val="clear" w:color="auto" w:fill="2B579A"/>
+          </w:tcPr>
+          <w:p>
+            <w:pPr>
+              <w:jc w:val="center"/>
+            </w:pPr>
+            <w:r>
+              <w:rPr>
+                <w:b/>
+                <w:color w:val="FFFFFF"/>
+                <w:sz w:val="20"/>
+              </w:rPr>
+              <w:t>值</w:t>
+            </w:r>
+          </w:p>
+        </w:tc>
+      </w:tr>
+      <w:tr>
+        <w:tc>
+          <w:tcPr>
+            <w:tcW w:type="dxa" w:w="1701"/>
+            <w:shd w:val="clear" w:color="auto" w:fill="F2F6FC"/>
+          </w:tcPr>
+          <w:p>
+            <w:r>
+              <w:rPr>
+                <w:sz w:val="18"/>
+              </w:rPr>
+              <w:t>文件名</w:t>
+            </w:r>
+          </w:p>
+        </w:tc>
+        <w:tc>
+          <w:tcPr>
+            <w:tcW w:type="dxa" w:w="7370"/>
+            <w:shd w:val="clear" w:color="auto" w:fill="F2F6FC"/>
+          </w:tcPr>
+          <w:p>
+            <w:r>
+              <w:rPr>
+                <w:sz w:val="18"/>
+              </w:rPr>
+              <w:t>candidate-center-still-works-after-offer-risk.png</w:t>
+            </w:r>
+          </w:p>
+        </w:tc>
+      </w:tr>
+      <w:tr>
+        <w:tc>
+          <w:tcPr>
+            <w:tcW w:type="dxa" w:w="1701"/>
+          </w:tcPr>
+          <w:p>
+            <w:r>
+              <w:rPr>
+                <w:sz w:val="18"/>
+              </w:rPr>
+              <w:t>描述</w:t>
+            </w:r>
+          </w:p>
+        </w:tc>
+        <w:tc>
+          <w:tcPr>
+            <w:tcW w:type="dxa" w:w="7370"/>
+          </w:tcPr>
+          <w:p>
+            <w:r>
+              <w:rPr>
+                <w:sz w:val="18"/>
+              </w:rPr>
+              <w:t>[Verify] Candidate Center</w:t>
+            </w:r>
+          </w:p>
+        </w:tc>
+      </w:tr>
+      <w:tr>
+        <w:tc>
+          <w:tcPr>
+            <w:tcW w:type="dxa" w:w="1701"/>
+            <w:shd w:val="clear" w:color="auto" w:fill="F2F6FC"/>
+          </w:tcPr>
+          <w:p>
+            <w:r>
+              <w:rPr>
+                <w:sz w:val="18"/>
+              </w:rPr>
+              <w:t>验证</w:t>
+            </w:r>
+          </w:p>
+        </w:tc>
+        <w:tc>
+          <w:tcPr>
+            <w:tcW w:type="dxa" w:w="7370"/>
+            <w:shd w:val="clear" w:color="auto" w:fill="F2F6FC"/>
+          </w:tcPr>
+          <w:p>
+            <w:r>
+              <w:rPr>
+                <w:sz w:val="18"/>
+              </w:rPr>
+              <w:t>未破坏</w:t>
+            </w:r>
+          </w:p>
+        </w:tc>
+      </w:tr>
+      <w:tr>
+        <w:tc>
+          <w:tcPr>
+            <w:tcW w:type="dxa" w:w="1701"/>
+          </w:tcPr>
+          <w:p>
+            <w:r>
+              <w:rPr>
+                <w:sz w:val="18"/>
+              </w:rPr>
+              <w:t>Mock</w:t>
+            </w:r>
+          </w:p>
+        </w:tc>
+        <w:tc>
+          <w:tcPr>
+            <w:tcW w:type="dxa" w:w="7370"/>
+          </w:tcPr>
+          <w:p>
+            <w:r>
+              <w:rPr>
+                <w:sz w:val="18"/>
+              </w:rPr>
+              <w:t>否</w:t>
+            </w:r>
+          </w:p>
+        </w:tc>
+      </w:tr>
+    </w:tbl>
+    <w:p/>
+    <w:p>
+      <w:pPr>
+        <w:jc w:val="center"/>
+      </w:pPr>
+      <w:r>
+        <w:drawing>
+          <wp:inline xmlns:a="http://schemas.openxmlformats.org/drawingml/2006/main" xmlns:pic="http://schemas.openxmlformats.org/drawingml/2006/picture">
+            <wp:extent cx="5029200" cy="3143250"/>
+            <wp:docPr id="16" name="Picture 16"/>
+            <wp:cNvGraphicFramePr>
+              <a:graphicFrameLocks noChangeAspect="1"/>
+            </wp:cNvGraphicFramePr>
+            <a:graphic>
+              <a:graphicData uri="http://schemas.openxmlformats.org/drawingml/2006/picture">
+                <pic:pic>
+                  <pic:nvPicPr>
+                    <pic:cNvPr id="0" name="candidate-center-still-works-after-offer-risk_u.png"/>
+                    <pic:cNvPicPr/>
+                  </pic:nvPicPr>
+                  <pic:blipFill>
+                    <a:blip r:embed="rId24"/>
+                    <a:stretch>
+                      <a:fillRect/>
+                    </a:stretch>
+                  </pic:blipFill>
+                  <pic:spPr>
+                    <a:xfrm>
+                      <a:off x="0" y="0"/>
+                      <a:ext cx="5029200" cy="3143250"/>
+                    </a:xfrm>
+                    <a:prstGeom prst="rect"/>
+                  </pic:spPr>
+                </pic:pic>
+              </a:graphicData>
+            </a:graphic>
+          </wp:inline>
+        </w:drawing>
+      </w:r>
+    </w:p>
+    <w:p/>
+    <w:p>
+      <w:pPr>
+        <w:pStyle w:val="Heading1"/>
+      </w:pPr>
+      <w:r>
+        <w:t>五、验收红线</w:t>
+      </w:r>
+    </w:p>
+    <w:tbl>
+      <w:tblPr>
+        <w:tblStyle w:val="TableGrid"/>
+        <w:tblW w:type="auto" w:w="0"/>
+        <w:jc w:val="center"/>
+        <w:tblLook w:firstColumn="1" w:firstRow="1" w:lastColumn="0" w:lastRow="0" w:noHBand="0" w:noVBand="1" w:val="04A0"/>
+      </w:tblPr>
+      <w:tblGrid>
+        <w:gridCol w:w="2880"/>
+        <w:gridCol w:w="2880"/>
+        <w:gridCol w:w="2880"/>
+      </w:tblGrid>
+      <w:tr>
+        <w:tc>
+          <w:tcPr>
+            <w:tcW w:type="dxa" w:w="2880"/>
+            <w:shd w:val="clear" w:color="auto" w:fill="2B579A"/>
+          </w:tcPr>
+          <w:p>
+            <w:pPr>
+              <w:jc w:val="center"/>
+            </w:pPr>
+            <w:r>
+              <w:rPr>
+                <w:b/>
+                <w:color w:val="FFFFFF"/>
+                <w:sz w:val="20"/>
+              </w:rPr>
+              <w:t>#</w:t>
+            </w:r>
+          </w:p>
+        </w:tc>
+        <w:tc>
+          <w:tcPr>
+            <w:tcW w:type="dxa" w:w="2880"/>
+            <w:shd w:val="clear" w:color="auto" w:fill="2B579A"/>
+          </w:tcPr>
+          <w:p>
+            <w:pPr>
+              <w:jc w:val="center"/>
+            </w:pPr>
+            <w:r>
+              <w:rPr>
+                <w:b/>
+                <w:color w:val="FFFFFF"/>
+                <w:sz w:val="20"/>
+              </w:rPr>
+              <w:t>红线</w:t>
+            </w:r>
+          </w:p>
+        </w:tc>
+        <w:tc>
+          <w:tcPr>
+            <w:tcW w:type="dxa" w:w="2880"/>
+            <w:shd w:val="clear" w:color="auto" w:fill="2B579A"/>
+          </w:tcPr>
+          <w:p>
+            <w:pPr>
+              <w:jc w:val="center"/>
+            </w:pPr>
+            <w:r>
+              <w:rPr>
+                <w:b/>
+                <w:color w:val="FFFFFF"/>
+                <w:sz w:val="20"/>
+              </w:rPr>
+              <w:t>状态</w:t>
+            </w:r>
+          </w:p>
+        </w:tc>
+      </w:tr>
+      <w:tr>
+        <w:tc>
+          <w:tcPr>
+            <w:tcW w:type="dxa" w:w="2880"/>
+            <w:shd w:val="clear" w:color="auto" w:fill="F2F6FC"/>
+          </w:tcPr>
+          <w:p>
+            <w:r>
+              <w:rPr>
+                <w:sz w:val="18"/>
+              </w:rPr>
+              <w:t>1</w:t>
+            </w:r>
+          </w:p>
+        </w:tc>
+        <w:tc>
+          <w:tcPr>
+            <w:tcW w:type="dxa" w:w="2880"/>
+            <w:shd w:val="clear" w:color="auto" w:fill="F2F6FC"/>
+          </w:tcPr>
+          <w:p>
+            <w:r>
+              <w:rPr>
+                <w:sz w:val="18"/>
+              </w:rPr>
+              <w:t>无发Offer/审批Offer</w:t>
+            </w:r>
+          </w:p>
+        </w:tc>
+        <w:tc>
+          <w:tcPr>
+            <w:tcW w:type="dxa" w:w="2880"/>
+            <w:shd w:val="clear" w:color="auto" w:fill="F2F6FC"/>
+          </w:tcPr>
+          <w:p>
+            <w:r>
+              <w:rPr>
+                <w:sz w:val="18"/>
+              </w:rPr>
+              <w:t>PASS</w:t>
+            </w:r>
+          </w:p>
+        </w:tc>
+      </w:tr>
+      <w:tr>
+        <w:tc>
+          <w:tcPr>
+            <w:tcW w:type="dxa" w:w="2880"/>
+          </w:tcPr>
+          <w:p>
+            <w:r>
+              <w:rPr>
+                <w:sz w:val="18"/>
+              </w:rPr>
+              <w:t>2</w:t>
+            </w:r>
+          </w:p>
+        </w:tc>
+        <w:tc>
+          <w:tcPr>
+            <w:tcW w:type="dxa" w:w="2880"/>
+          </w:tcPr>
+          <w:p>
+            <w:r>
+              <w:rPr>
+                <w:sz w:val="18"/>
+              </w:rPr>
+              <w:t>无一键通过/一键淘汰</w:t>
+            </w:r>
+          </w:p>
+        </w:tc>
+        <w:tc>
+          <w:tcPr>
+            <w:tcW w:type="dxa" w:w="2880"/>
+          </w:tcPr>
+          <w:p>
+            <w:r>
+              <w:rPr>
+                <w:sz w:val="18"/>
+              </w:rPr>
+              <w:t>PASS</w:t>
+            </w:r>
+          </w:p>
+        </w:tc>
+      </w:tr>
+      <w:tr>
+        <w:tc>
+          <w:tcPr>
+            <w:tcW w:type="dxa" w:w="2880"/>
+            <w:shd w:val="clear" w:color="auto" w:fill="F2F6FC"/>
+          </w:tcPr>
+          <w:p>
+            <w:r>
+              <w:rPr>
+                <w:sz w:val="18"/>
+              </w:rPr>
+              <w:t>3</w:t>
+            </w:r>
+          </w:p>
+        </w:tc>
+        <w:tc>
+          <w:tcPr>
+            <w:tcW w:type="dxa" w:w="2880"/>
+            <w:shd w:val="clear" w:color="auto" w:fill="F2F6FC"/>
+          </w:tcPr>
+          <w:p>
+            <w:r>
+              <w:rPr>
+                <w:sz w:val="18"/>
+              </w:rPr>
+              <w:t>不替代 Moka</w:t>
+            </w:r>
+          </w:p>
+        </w:tc>
+        <w:tc>
+          <w:tcPr>
+            <w:tcW w:type="dxa" w:w="2880"/>
+            <w:shd w:val="clear" w:color="auto" w:fill="F2F6FC"/>
+          </w:tcPr>
+          <w:p>
+            <w:r>
+              <w:rPr>
+                <w:sz w:val="18"/>
+              </w:rPr>
+              <w:t>PASS</w:t>
+            </w:r>
+          </w:p>
+        </w:tc>
+      </w:tr>
+      <w:tr>
+        <w:tc>
+          <w:tcPr>
+            <w:tcW w:type="dxa" w:w="2880"/>
+          </w:tcPr>
+          <w:p>
+            <w:r>
+              <w:rPr>
+                <w:sz w:val="18"/>
+              </w:rPr>
+              <w:t>4</w:t>
+            </w:r>
+          </w:p>
+        </w:tc>
+        <w:tc>
+          <w:tcPr>
+            <w:tcW w:type="dxa" w:w="2880"/>
+          </w:tcPr>
+          <w:p>
+            <w:r>
+              <w:rPr>
+                <w:sz w:val="18"/>
+              </w:rPr>
+              <w:t>无 AI 自动淘汰/录用</w:t>
+            </w:r>
+          </w:p>
+        </w:tc>
+        <w:tc>
+          <w:tcPr>
+            <w:tcW w:type="dxa" w:w="2880"/>
+          </w:tcPr>
+          <w:p>
+            <w:r>
+              <w:rPr>
+                <w:sz w:val="18"/>
+              </w:rPr>
+              <w:t>PASS</w:t>
+            </w:r>
+          </w:p>
+        </w:tc>
+      </w:tr>
+      <w:tr>
+        <w:tc>
+          <w:tcPr>
+            <w:tcW w:type="dxa" w:w="2880"/>
+            <w:shd w:val="clear" w:color="auto" w:fill="F2F6FC"/>
+          </w:tcPr>
+          <w:p>
+            <w:r>
+              <w:rPr>
+                <w:sz w:val="18"/>
+              </w:rPr>
+              <w:t>5</w:t>
+            </w:r>
+          </w:p>
+        </w:tc>
+        <w:tc>
+          <w:tcPr>
+            <w:tcW w:type="dxa" w:w="2880"/>
+            <w:shd w:val="clear" w:color="auto" w:fill="F2F6FC"/>
+          </w:tcPr>
+          <w:p>
+            <w:r>
+              <w:rPr>
+                <w:sz w:val="18"/>
+              </w:rPr>
+              <w:t>不展示敏感薪资/手机号/邮箱</w:t>
+            </w:r>
+          </w:p>
+        </w:tc>
+        <w:tc>
+          <w:tcPr>
+            <w:tcW w:type="dxa" w:w="2880"/>
+            <w:shd w:val="clear" w:color="auto" w:fill="F2F6FC"/>
+          </w:tcPr>
+          <w:p>
+            <w:r>
+              <w:rPr>
+                <w:sz w:val="18"/>
+              </w:rPr>
+              <w:t>PASS</w:t>
+            </w:r>
+          </w:p>
+        </w:tc>
+      </w:tr>
+      <w:tr>
+        <w:tc>
+          <w:tcPr>
+            <w:tcW w:type="dxa" w:w="2880"/>
+          </w:tcPr>
+          <w:p>
+            <w:r>
+              <w:rPr>
+                <w:sz w:val="18"/>
+              </w:rPr>
+              <w:t>6</w:t>
+            </w:r>
+          </w:p>
+        </w:tc>
+        <w:tc>
+          <w:tcPr>
+            <w:tcW w:type="dxa" w:w="2880"/>
+          </w:tcPr>
+          <w:p>
+            <w:r>
+              <w:rPr>
+                <w:sz w:val="18"/>
+              </w:rPr>
+              <w:t>Closing Plan 有证据</w:t>
+            </w:r>
+          </w:p>
+        </w:tc>
+        <w:tc>
+          <w:tcPr>
+            <w:tcW w:type="dxa" w:w="2880"/>
+          </w:tcPr>
+          <w:p>
+            <w:r>
+              <w:rPr>
+                <w:sz w:val="18"/>
+              </w:rPr>
+              <w:t>PASS</w:t>
+            </w:r>
+          </w:p>
+        </w:tc>
+      </w:tr>
+      <w:tr>
+        <w:tc>
+          <w:tcPr>
+            <w:tcW w:type="dxa" w:w="2880"/>
+            <w:shd w:val="clear" w:color="auto" w:fill="F2F6FC"/>
+          </w:tcPr>
+          <w:p>
+            <w:r>
+              <w:rPr>
+                <w:sz w:val="18"/>
+              </w:rPr>
+              <w:t>7</w:t>
+            </w:r>
+          </w:p>
+        </w:tc>
+        <w:tc>
+          <w:tcPr>
+            <w:tcW w:type="dxa" w:w="2880"/>
+            <w:shd w:val="clear" w:color="auto" w:fill="F2F6FC"/>
+          </w:tcPr>
+          <w:p>
+            <w:r>
+              <w:rPr>
+                <w:sz w:val="18"/>
+              </w:rPr>
+              <w:t>Insights system_rule</w:t>
+            </w:r>
+          </w:p>
+        </w:tc>
+        <w:tc>
+          <w:tcPr>
+            <w:tcW w:type="dxa" w:w="2880"/>
+            <w:shd w:val="clear" w:color="auto" w:fill="F2F6FC"/>
+          </w:tcPr>
+          <w:p>
+            <w:r>
+              <w:rPr>
+                <w:sz w:val="18"/>
+              </w:rPr>
+              <w:t>PASS</w:t>
+            </w:r>
+          </w:p>
+        </w:tc>
+      </w:tr>
+      <w:tr>
+        <w:tc>
+          <w:tcPr>
+            <w:tcW w:type="dxa" w:w="2880"/>
+          </w:tcPr>
+          <w:p>
+            <w:r>
+              <w:rPr>
+                <w:sz w:val="18"/>
+              </w:rPr>
+              <w:t>8</w:t>
+            </w:r>
+          </w:p>
+        </w:tc>
+        <w:tc>
+          <w:tcPr>
+            <w:tcW w:type="dxa" w:w="2880"/>
+          </w:tcPr>
+          <w:p>
+            <w:r>
+              <w:rPr>
+                <w:sz w:val="18"/>
+              </w:rPr>
+              <w:t>Provenance 可读</w:t>
+            </w:r>
+          </w:p>
+        </w:tc>
+        <w:tc>
+          <w:tcPr>
+            <w:tcW w:type="dxa" w:w="2880"/>
+          </w:tcPr>
+          <w:p>
+            <w:r>
+              <w:rPr>
+                <w:sz w:val="18"/>
+              </w:rPr>
+              <w:t>PASS</w:t>
+            </w:r>
+          </w:p>
+        </w:tc>
+      </w:tr>
+      <w:tr>
+        <w:tc>
+          <w:tcPr>
+            <w:tcW w:type="dxa" w:w="2880"/>
+            <w:shd w:val="clear" w:color="auto" w:fill="F2F6FC"/>
+          </w:tcPr>
+          <w:p>
+            <w:r>
+              <w:rPr>
+                <w:sz w:val="18"/>
+              </w:rPr>
+              <w:t>9</w:t>
+            </w:r>
+          </w:p>
+        </w:tc>
+        <w:tc>
+          <w:tcPr>
+            <w:tcW w:type="dxa" w:w="2880"/>
+            <w:shd w:val="clear" w:color="auto" w:fill="F2F6FC"/>
+          </w:tcPr>
+          <w:p>
+            <w:r>
+              <w:rPr>
+                <w:sz w:val="18"/>
+              </w:rPr>
+              <w:t>Activity 人话化</w:t>
+            </w:r>
+          </w:p>
+        </w:tc>
+        <w:tc>
+          <w:tcPr>
+            <w:tcW w:type="dxa" w:w="2880"/>
+            <w:shd w:val="clear" w:color="auto" w:fill="F2F6FC"/>
+          </w:tcPr>
+          <w:p>
+            <w:r>
+              <w:rPr>
+                <w:sz w:val="18"/>
+              </w:rPr>
+              <w:t>PASS</w:t>
+            </w:r>
+          </w:p>
+        </w:tc>
+      </w:tr>
+      <w:tr>
+        <w:tc>
+          <w:tcPr>
+            <w:tcW w:type="dxa" w:w="2880"/>
+          </w:tcPr>
+          <w:p>
+            <w:r>
+              <w:rPr>
+                <w:sz w:val="18"/>
+              </w:rPr>
+              <w:t>10</w:t>
+            </w:r>
+          </w:p>
+        </w:tc>
+        <w:tc>
+          <w:tcPr>
+            <w:tcW w:type="dxa" w:w="2880"/>
+          </w:tcPr>
+          <w:p>
+            <w:r>
+              <w:rPr>
+                <w:sz w:val="18"/>
+              </w:rPr>
+              <w:t>截图 &gt;= 16</w:t>
+            </w:r>
+          </w:p>
+        </w:tc>
+        <w:tc>
+          <w:tcPr>
+            <w:tcW w:type="dxa" w:w="2880"/>
+          </w:tcPr>
+          <w:p>
+            <w:r>
+              <w:rPr>
+                <w:sz w:val="18"/>
+              </w:rPr>
+              <w:t>PASS (16)</w:t>
+            </w:r>
+          </w:p>
+        </w:tc>
+      </w:tr>
+      <w:tr>
+        <w:tc>
+          <w:tcPr>
+            <w:tcW w:type="dxa" w:w="2880"/>
+            <w:shd w:val="clear" w:color="auto" w:fill="F2F6FC"/>
+          </w:tcPr>
+          <w:p>
+            <w:r>
+              <w:rPr>
+                <w:sz w:val="18"/>
+              </w:rPr>
+              <w:t>11</w:t>
+            </w:r>
+          </w:p>
+        </w:tc>
+        <w:tc>
+          <w:tcPr>
+            <w:tcW w:type="dxa" w:w="2880"/>
+            <w:shd w:val="clear" w:color="auto" w:fill="F2F6FC"/>
+          </w:tcPr>
+          <w:p>
+            <w:r>
+              <w:rPr>
+                <w:sz w:val="18"/>
+              </w:rPr>
+              <w:t>API Evidence 完整</w:t>
+            </w:r>
+          </w:p>
+        </w:tc>
+        <w:tc>
+          <w:tcPr>
+            <w:tcW w:type="dxa" w:w="2880"/>
+            <w:shd w:val="clear" w:color="auto" w:fill="F2F6FC"/>
+          </w:tcPr>
+          <w:p>
+            <w:r>
+              <w:rPr>
+                <w:sz w:val="18"/>
+              </w:rPr>
+              <w:t>PASS</w:t>
+            </w:r>
+          </w:p>
+        </w:tc>
+      </w:tr>
+      <w:tr>
+        <w:tc>
+          <w:tcPr>
+            <w:tcW w:type="dxa" w:w="2880"/>
+          </w:tcPr>
+          <w:p>
+            <w:r>
+              <w:rPr>
+                <w:sz w:val="18"/>
+              </w:rPr>
+              <w:t>12</w:t>
+            </w:r>
+          </w:p>
+        </w:tc>
+        <w:tc>
+          <w:tcPr>
+            <w:tcW w:type="dxa" w:w="2880"/>
+          </w:tcPr>
+          <w:p>
+            <w:r>
+              <w:rPr>
+                <w:sz w:val="18"/>
+              </w:rPr>
+              <w:t>typecheck/lint/build 通过</w:t>
+            </w:r>
+          </w:p>
+        </w:tc>
+        <w:tc>
+          <w:tcPr>
+            <w:tcW w:type="dxa" w:w="2880"/>
+          </w:tcPr>
+          <w:p>
+            <w:r>
+              <w:rPr>
+                <w:sz w:val="18"/>
+              </w:rPr>
+              <w:t>PASS</w:t>
+            </w:r>
+          </w:p>
+        </w:tc>
+      </w:tr>
+    </w:tbl>
+    <w:p/>
+    <w:p>
+      <w:pPr>
+        <w:pStyle w:val="Heading1"/>
+      </w:pPr>
+      <w:r>
+        <w:t>六、最终结论</w:t>
+      </w:r>
+    </w:p>
+    <w:tbl>
+      <w:tblPr>
+        <w:tblStyle w:val="TableGrid"/>
+        <w:tblW w:type="auto" w:w="0"/>
+        <w:jc w:val="center"/>
+        <w:tblLook w:firstColumn="1" w:firstRow="1" w:lastColumn="0" w:lastRow="0" w:noHBand="0" w:noVBand="1" w:val="04A0"/>
+      </w:tblPr>
+      <w:tblGrid>
+        <w:gridCol w:w="4320"/>
+        <w:gridCol w:w="4320"/>
+      </w:tblGrid>
+      <w:tr>
+        <w:tc>
+          <w:tcPr>
+            <w:tcW w:type="dxa" w:w="4320"/>
+            <w:shd w:val="clear" w:color="auto" w:fill="2B579A"/>
+          </w:tcPr>
+          <w:p>
+            <w:pPr>
+              <w:jc w:val="center"/>
+            </w:pPr>
+            <w:r>
+              <w:rPr>
+                <w:b/>
+                <w:color w:val="FFFFFF"/>
+                <w:sz w:val="20"/>
+              </w:rPr>
+              <w:t>项目</w:t>
+            </w:r>
+          </w:p>
+        </w:tc>
+        <w:tc>
+          <w:tcPr>
+            <w:tcW w:type="dxa" w:w="4320"/>
+            <w:shd w:val="clear" w:color="auto" w:fill="2B579A"/>
+          </w:tcPr>
+          <w:p>
+            <w:pPr>
+              <w:jc w:val="center"/>
+            </w:pPr>
+            <w:r>
+              <w:rPr>
+                <w:b/>
+                <w:color w:val="FFFFFF"/>
+                <w:sz w:val="20"/>
+              </w:rPr>
+              <w:t>结论</w:t>
+            </w:r>
+          </w:p>
+        </w:tc>
+      </w:tr>
+      <w:tr>
+        <w:tc>
+          <w:tcPr>
             <w:tcW w:type="dxa" w:w="4320"/>
             <w:shd w:val="clear" w:color="auto" w:fill="F2F6FC"/>
           </w:tcPr>
@@ -2881,7 +5468,7 @@
               <w:rPr>
                 <w:sz w:val="18"/>
               </w:rPr>
-              <w:t>是否只做分析不做流程推进</w:t>
+              <w:t>7 Tab Drawer 是否完成</w:t>
             </w:r>
           </w:p>
         </w:tc>
@@ -2910,7 +5497,7 @@
               <w:rPr>
                 <w:sz w:val="18"/>
               </w:rPr>
-              <w:t>是否不替代 Moka</w:t>
+              <w:t>Risk Factors 是否完成</w:t>
             </w:r>
           </w:p>
         </w:tc>
@@ -2939,7 +5526,7 @@
               <w:rPr>
                 <w:sz w:val="18"/>
               </w:rPr>
-              <w:t>是否展示敏感薪资</w:t>
+              <w:t>Closing Plan 是否完成</w:t>
             </w:r>
           </w:p>
         </w:tc>
@@ -2952,7 +5539,7 @@
               <w:rPr>
                 <w:sz w:val="18"/>
               </w:rPr>
-              <w:t>否</w:t>
+              <w:t>是</w:t>
             </w:r>
           </w:p>
         </w:tc>
@@ -2968,7 +5555,7 @@
               <w:rPr>
                 <w:sz w:val="18"/>
               </w:rPr>
-              <w:t>是否接 OpenAI</w:t>
+              <w:t>System Insights 是否完成</w:t>
             </w:r>
           </w:p>
         </w:tc>
@@ -2982,7 +5569,7 @@
               <w:rPr>
                 <w:sz w:val="18"/>
               </w:rPr>
-              <w:t>否</w:t>
+              <w:t>是</w:t>
             </w:r>
           </w:p>
         </w:tc>
@@ -2997,7 +5584,7 @@
               <w:rPr>
                 <w:sz w:val="18"/>
               </w:rPr>
-              <w:t>是否伪造 LLM</w:t>
+              <w:t>是否只做分析不做流程推进</w:t>
             </w:r>
           </w:p>
         </w:tc>
@@ -3010,7 +5597,7 @@
               <w:rPr>
                 <w:sz w:val="18"/>
               </w:rPr>
-              <w:t>否</w:t>
+              <w:t>是</w:t>
             </w:r>
           </w:p>
         </w:tc>
@@ -3026,7 +5613,7 @@
               <w:rPr>
                 <w:sz w:val="18"/>
               </w:rPr>
-              <w:t>是否破坏 Action Center</w:t>
+              <w:t>是否不替代 Moka</w:t>
             </w:r>
           </w:p>
         </w:tc>
@@ -3040,7 +5627,7 @@
               <w:rPr>
                 <w:sz w:val="18"/>
               </w:rPr>
-              <w:t>否</w:t>
+              <w:t>是</w:t>
             </w:r>
           </w:p>
         </w:tc>
@@ -3055,6 +5642,122 @@
               <w:rPr>
                 <w:sz w:val="18"/>
               </w:rPr>
+              <w:t>是否展示敏感薪资</w:t>
+            </w:r>
+          </w:p>
+        </w:tc>
+        <w:tc>
+          <w:tcPr>
+            <w:tcW w:type="dxa" w:w="4320"/>
+          </w:tcPr>
+          <w:p>
+            <w:r>
+              <w:rPr>
+                <w:sz w:val="18"/>
+              </w:rPr>
+              <w:t>否</w:t>
+            </w:r>
+          </w:p>
+        </w:tc>
+      </w:tr>
+      <w:tr>
+        <w:tc>
+          <w:tcPr>
+            <w:tcW w:type="dxa" w:w="4320"/>
+            <w:shd w:val="clear" w:color="auto" w:fill="F2F6FC"/>
+          </w:tcPr>
+          <w:p>
+            <w:r>
+              <w:rPr>
+                <w:sz w:val="18"/>
+              </w:rPr>
+              <w:t>是否接 OpenAI</w:t>
+            </w:r>
+          </w:p>
+        </w:tc>
+        <w:tc>
+          <w:tcPr>
+            <w:tcW w:type="dxa" w:w="4320"/>
+            <w:shd w:val="clear" w:color="auto" w:fill="F2F6FC"/>
+          </w:tcPr>
+          <w:p>
+            <w:r>
+              <w:rPr>
+                <w:sz w:val="18"/>
+              </w:rPr>
+              <w:t>否</w:t>
+            </w:r>
+          </w:p>
+        </w:tc>
+      </w:tr>
+      <w:tr>
+        <w:tc>
+          <w:tcPr>
+            <w:tcW w:type="dxa" w:w="4320"/>
+          </w:tcPr>
+          <w:p>
+            <w:r>
+              <w:rPr>
+                <w:sz w:val="18"/>
+              </w:rPr>
+              <w:t>是否伪造 LLM</w:t>
+            </w:r>
+          </w:p>
+        </w:tc>
+        <w:tc>
+          <w:tcPr>
+            <w:tcW w:type="dxa" w:w="4320"/>
+          </w:tcPr>
+          <w:p>
+            <w:r>
+              <w:rPr>
+                <w:sz w:val="18"/>
+              </w:rPr>
+              <w:t>否</w:t>
+            </w:r>
+          </w:p>
+        </w:tc>
+      </w:tr>
+      <w:tr>
+        <w:tc>
+          <w:tcPr>
+            <w:tcW w:type="dxa" w:w="4320"/>
+            <w:shd w:val="clear" w:color="auto" w:fill="F2F6FC"/>
+          </w:tcPr>
+          <w:p>
+            <w:r>
+              <w:rPr>
+                <w:sz w:val="18"/>
+              </w:rPr>
+              <w:t>是否破坏 Action Center</w:t>
+            </w:r>
+          </w:p>
+        </w:tc>
+        <w:tc>
+          <w:tcPr>
+            <w:tcW w:type="dxa" w:w="4320"/>
+            <w:shd w:val="clear" w:color="auto" w:fill="F2F6FC"/>
+          </w:tcPr>
+          <w:p>
+            <w:r>
+              <w:rPr>
+                <w:sz w:val="18"/>
+              </w:rPr>
+              <w:t>否</w:t>
+            </w:r>
+          </w:p>
+        </w:tc>
+      </w:tr>
+      <w:tr>
+        <w:tc>
+          <w:tcPr>
+            <w:tcW w:type="dxa" w:w="4320"/>
+          </w:tcPr>
+          <w:p>
+            <w:r>
+              <w:rPr>
+                <w:sz w:val="18"/>
+              </w:rPr>
               <w:t>是否破坏 Candidate Center</w:t>
             </w:r>
           </w:p>
@@ -3069,6 +5772,64 @@
                 <w:sz w:val="18"/>
               </w:rPr>
               <w:t>否</w:t>
+            </w:r>
+          </w:p>
+        </w:tc>
+      </w:tr>
+      <w:tr>
+        <w:tc>
+          <w:tcPr>
+            <w:tcW w:type="dxa" w:w="4320"/>
+            <w:shd w:val="clear" w:color="auto" w:fill="F2F6FC"/>
+          </w:tcPr>
+          <w:p>
+            <w:r>
+              <w:rPr>
+                <w:sz w:val="18"/>
+              </w:rPr>
+              <w:t>截图是否 &gt;= 16</w:t>
+            </w:r>
+          </w:p>
+        </w:tc>
+        <w:tc>
+          <w:tcPr>
+            <w:tcW w:type="dxa" w:w="4320"/>
+            <w:shd w:val="clear" w:color="auto" w:fill="F2F6FC"/>
+          </w:tcPr>
+          <w:p>
+            <w:r>
+              <w:rPr>
+                <w:sz w:val="18"/>
+              </w:rPr>
+              <w:t>是 (16)</w:t>
+            </w:r>
+          </w:p>
+        </w:tc>
+      </w:tr>
+      <w:tr>
+        <w:tc>
+          <w:tcPr>
+            <w:tcW w:type="dxa" w:w="4320"/>
+          </w:tcPr>
+          <w:p>
+            <w:r>
+              <w:rPr>
+                <w:sz w:val="18"/>
+              </w:rPr>
+              <w:t>API Evidence 是否完整</w:t>
+            </w:r>
+          </w:p>
+        </w:tc>
+        <w:tc>
+          <w:tcPr>
+            <w:tcW w:type="dxa" w:w="4320"/>
+          </w:tcPr>
+          <w:p>
+            <w:r>
+              <w:rPr>
+                <w:sz w:val="18"/>
+              </w:rPr>
+              <w:t>是 (6条)</w:t>
             </w:r>
           </w:p>
         </w:tc>

</xml_diff>